<commit_message>
Month-end KPI update: tickets 372, SLA 97.6%, MTTR 22.1h
Update portfolio.ts and CV (Word + PDF) with approved Phase B numbers.
Overdue remains zero; restoration remains 100%.
</commit_message>
<xml_diff>
--- a/public/cv/Romeo_David_Jr_CV_Final_ATS.docx
+++ b/public/cv/Romeo_David_Jr_CV_Final_ATS.docx
@@ -1,5 +1,36 @@
 
-<file path=word/document.xml><?xml version="1.0" encoding="utf-8"?>
+<file path=docProps\app.xml><?xml version="1.0" encoding="utf-8"?>
+<Properties xmlns="http://schemas.openxmlformats.org/officeDocument/2006/extended-properties" xmlns:vt="http://schemas.openxmlformats.org/officeDocument/2006/docPropsVTypes">
+  <Template>Normal</Template>
+  <TotalTime>1</TotalTime>
+  <Pages>2</Pages>
+  <Words>946</Words>
+  <Characters>5395</Characters>
+  <Application>Microsoft Office Word</Application>
+  <DocSecurity>0</DocSecurity>
+  <Lines>44</Lines>
+  <Paragraphs>12</Paragraphs>
+  <ScaleCrop>false</ScaleCrop>
+  <Company/>
+  <LinksUpToDate>false</LinksUpToDate>
+  <CharactersWithSpaces>6329</CharactersWithSpaces>
+  <SharedDoc>false</SharedDoc>
+  <HyperlinksChanged>false</HyperlinksChanged>
+  <AppVersion>16.0000</AppVersion>
+</Properties>
+</file>
+
+<file path=docProps\core.xml><?xml version="1.0" encoding="utf-8"?>
+<cp:coreProperties xmlns:cp="http://schemas.openxmlformats.org/package/2006/metadata/core-properties" xmlns:dc="http://purl.org/dc/elements/1.1/" xmlns:dcterms="http://purl.org/dc/terms/" xmlns:dcmitype="http://purl.org/dc/dcmitype/" xmlns:xsi="http://www.w3.org/2001/XMLSchema-instance">
+  <dc:creator>Un-named</dc:creator>
+  <cp:lastModifiedBy>A1863</cp:lastModifiedBy>
+  <cp:revision>2</cp:revision>
+  <dcterms:created xsi:type="dcterms:W3CDTF">2026-07-23T11:54:00Z</dcterms:created>
+  <dcterms:modified xsi:type="dcterms:W3CDTF">2026-07-23T11:56:00Z</dcterms:modified>
+</cp:coreProperties>
+</file>
+
+<file path=word\document.xml><?xml version="1.0" encoding="utf-8"?>
 <w:document xmlns:wpc="http://schemas.microsoft.com/office/word/2010/wordprocessingCanvas" xmlns:cx="http://schemas.microsoft.com/office/drawing/2014/chartex" xmlns:cx1="http://schemas.microsoft.com/office/drawing/2015/9/8/chartex" xmlns:cx2="http://schemas.microsoft.com/office/drawing/2015/10/21/chartex" xmlns:cx3="http://schemas.microsoft.com/office/drawing/2016/5/9/chartex" xmlns:cx4="http://schemas.microsoft.com/office/drawing/2016/5/10/chartex" xmlns:cx5="http://schemas.microsoft.com/office/drawing/2016/5/11/chartex" xmlns:cx6="http://schemas.microsoft.com/office/drawing/2016/5/12/chartex" xmlns:cx7="http://schemas.microsoft.com/office/drawing/2016/5/13/chartex" xmlns:cx8="http://schemas.microsoft.com/office/drawing/2016/5/14/chartex" xmlns:mc="http://schemas.openxmlformats.org/markup-compatibility/2006" xmlns:aink="http://schemas.microsoft.com/office/drawing/2016/ink" xmlns:am3d="http://schemas.microsoft.com/office/drawing/2017/model3d" xmlns:o="urn:schemas-microsoft-com:office:office" xmlns:oel="http://schemas.microsoft.com/office/2019/extlst" xmlns:r="http://schemas.openxmlformats.org/officeDocument/2006/relationships" xmlns:m="http://schemas.openxmlformats.org/officeDocument/2006/math" xmlns:v="urn:schemas-microsoft-com:vml" xmlns:wp14="http://schemas.microsoft.com/office/word/2010/wordprocessingDrawing" xmlns:wp="http://schemas.openxmlformats.org/drawingml/2006/wordprocessingDrawing" xmlns:w10="urn:schemas-microsoft-com:office:word" xmlns:w="http://schemas.openxmlformats.org/wordprocessingml/2006/main" xmlns:w14="http://schemas.microsoft.com/office/word/2010/wordml" xmlns:w15="http://schemas.microsoft.com/office/word/2012/wordml" xmlns:w16cei="http://schemas.microsoft.com/office/word/2026/wordml/cei" xmlns:w16cex="http://schemas.microsoft.com/office/word/2018/wordml/cex" xmlns:w16cid="http://schemas.microsoft.com/office/word/2016/wordml/cid" xmlns:w16="http://schemas.microsoft.com/office/word/2018/wordml" xmlns:w16du="http://schemas.microsoft.com/office/word/2023/wordml/word16du" xmlns:w16sdtdh="http://schemas.microsoft.com/office/word/2020/wordml/sdtdatahash" xmlns:w16sdtfl="http://schemas.microsoft.com/office/word/2024/wordml/sdtformatlock" xmlns:w16se="http://schemas.microsoft.com/office/word/2015/wordml/symex" xmlns:wpg="http://schemas.microsoft.com/office/word/2010/wordprocessingGroup" xmlns:wpi="http://schemas.microsoft.com/office/word/2010/wordprocessingInk" xmlns:wne="http://schemas.microsoft.com/office/word/2006/wordml" xmlns:wps="http://schemas.microsoft.com/office/word/2010/wordprocessingShape" mc:Ignorable="w14 w15 w16se w16cid w16 w16cex w16sdtdh w16sdtfl w16du wp14">
   <w:body>
     <w:p>
@@ -203,7 +234,7 @@
         <w:spacing w:after="34"/>
       </w:pPr>
       <w:r>
-        <w:t>Senior Telecommunications Engineer with 19+ years of experience in multi-vendor network operations, project delivery, and operational automation. Currently leading O&amp;M for IDEMIA MestaFusion ATMS across 100+ sites in KSA Central Region, achieving 97.4% YTD SLA compliance with an average MTTR of 22.5 hours. Independently developed practical Python and PowerShell automation tools and Power BI dashboards that reduce daily data-processing time by 65–80%. Combines deep telecom expertise with Generative AI and Agentic AI-assisted development to deliver efficient, real-world solutions.</w:t>
+        <w:t>Senior Telecommunications Engineer with 19+ years of experience in multi-vendor network operations, project delivery, and operational automation. Currently leading O&amp;M for IDEMIA MestaFusion ATMS across 100+ sites in KSA Central Region, achieving 97.6% YTD SLA compliance with an average MTTR of 22.1 hours. Independently developed practical Python and PowerShell automation tools and Power BI dashboards that reduce daily data-processing time by 65–80%. Combines deep telecom expertise with Generative AI and Agentic AI-assisted development to deliver efficient, real-world solutions.</w:t>
       </w:r>
       <w:proofErr w:type="spellStart"/>
       <w:r/>
@@ -478,7 +509,7 @@
         <w:spacing w:after="5"/>
       </w:pPr>
       <w:r>
-        <w:t>Achieved 97.4% YTD SLA compliance across 346 O&amp;M tickets with zero overdue tickets and 100% restoration rate; maintained average MTTR of 22.5 hours.</w:t>
+        <w:t>Achieved 97.6% YTD SLA compliance across 372 O&amp;M tickets with zero overdue tickets and 100% restoration rate; maintained average MTTR of 22.1 hours.</w:t>
       </w:r>
     </w:p>
     <w:p>
@@ -1368,7 +1399,7 @@
 </w:document>
 </file>
 
-<file path=word/endnotes.xml><?xml version="1.0" encoding="utf-8"?>
+<file path=word\endnotes.xml><?xml version="1.0" encoding="utf-8"?>
 <w:endnotes xmlns:wpc="http://schemas.microsoft.com/office/word/2010/wordprocessingCanvas" xmlns:cx="http://schemas.microsoft.com/office/drawing/2014/chartex" xmlns:cx1="http://schemas.microsoft.com/office/drawing/2015/9/8/chartex" xmlns:cx2="http://schemas.microsoft.com/office/drawing/2015/10/21/chartex" xmlns:cx3="http://schemas.microsoft.com/office/drawing/2016/5/9/chartex" xmlns:cx4="http://schemas.microsoft.com/office/drawing/2016/5/10/chartex" xmlns:cx5="http://schemas.microsoft.com/office/drawing/2016/5/11/chartex" xmlns:cx6="http://schemas.microsoft.com/office/drawing/2016/5/12/chartex" xmlns:cx7="http://schemas.microsoft.com/office/drawing/2016/5/13/chartex" xmlns:cx8="http://schemas.microsoft.com/office/drawing/2016/5/14/chartex" xmlns:mc="http://schemas.openxmlformats.org/markup-compatibility/2006" xmlns:aink="http://schemas.microsoft.com/office/drawing/2016/ink" xmlns:am3d="http://schemas.microsoft.com/office/drawing/2017/model3d" xmlns:o="urn:schemas-microsoft-com:office:office" xmlns:oel="http://schemas.microsoft.com/office/2019/extlst" xmlns:r="http://schemas.openxmlformats.org/officeDocument/2006/relationships" xmlns:m="http://schemas.openxmlformats.org/officeDocument/2006/math" xmlns:v="urn:schemas-microsoft-com:vml" xmlns:wp14="http://schemas.microsoft.com/office/word/2010/wordprocessingDrawing" xmlns:wp="http://schemas.openxmlformats.org/drawingml/2006/wordprocessingDrawing" xmlns:w10="urn:schemas-microsoft-com:office:word" xmlns:w="http://schemas.openxmlformats.org/wordprocessingml/2006/main" xmlns:w14="http://schemas.microsoft.com/office/word/2010/wordml" xmlns:w15="http://schemas.microsoft.com/office/word/2012/wordml" xmlns:w16cei="http://schemas.microsoft.com/office/word/2026/wordml/cei" xmlns:w16cex="http://schemas.microsoft.com/office/word/2018/wordml/cex" xmlns:w16cid="http://schemas.microsoft.com/office/word/2016/wordml/cid" xmlns:w16="http://schemas.microsoft.com/office/word/2018/wordml" xmlns:w16du="http://schemas.microsoft.com/office/word/2023/wordml/word16du" xmlns:w16sdtdh="http://schemas.microsoft.com/office/word/2020/wordml/sdtdatahash" xmlns:w16sdtfl="http://schemas.microsoft.com/office/word/2024/wordml/sdtformatlock" xmlns:w16se="http://schemas.microsoft.com/office/word/2015/wordml/symex" xmlns:wpg="http://schemas.microsoft.com/office/word/2010/wordprocessingGroup" xmlns:wpi="http://schemas.microsoft.com/office/word/2010/wordprocessingInk" xmlns:wne="http://schemas.microsoft.com/office/word/2006/wordml" xmlns:wps="http://schemas.microsoft.com/office/word/2010/wordprocessingShape" mc:Ignorable="w14 w15 w16se w16cid w16 w16cex w16sdtdh w16sdtfl w16du wp14">
   <w:endnote w:type="separator" w:id="-1">
     <w:p>
@@ -1387,7 +1418,38 @@
 </w:endnotes>
 </file>
 
-<file path=word/footer1.xml><?xml version="1.0" encoding="utf-8"?>
+<file path=word\fontTable.xml><?xml version="1.0" encoding="utf-8"?>
+<w:fonts xmlns:mc="http://schemas.openxmlformats.org/markup-compatibility/2006" xmlns:r="http://schemas.openxmlformats.org/officeDocument/2006/relationships" xmlns:w="http://schemas.openxmlformats.org/wordprocessingml/2006/main" xmlns:w14="http://schemas.microsoft.com/office/word/2010/wordml" xmlns:w15="http://schemas.microsoft.com/office/word/2012/wordml" xmlns:w16cex="http://schemas.microsoft.com/office/word/2018/wordml/cex" xmlns:w16cid="http://schemas.microsoft.com/office/word/2016/wordml/cid" xmlns:w16="http://schemas.microsoft.com/office/word/2018/wordml" xmlns:w16du="http://schemas.microsoft.com/office/word/2023/wordml/word16du" xmlns:w16sdtdh="http://schemas.microsoft.com/office/word/2020/wordml/sdtdatahash" xmlns:w16sdtfl="http://schemas.microsoft.com/office/word/2024/wordml/sdtformatlock" xmlns:w16se="http://schemas.microsoft.com/office/word/2015/wordml/symex" mc:Ignorable="w14 w15 w16se w16cid w16 w16cex w16sdtdh w16sdtfl w16du">
+  <w:font w:name="Calibri">
+    <w:panose1 w:val="020F0502020204030204"/>
+    <w:charset w:val="00"/>
+    <w:family w:val="swiss"/>
+    <w:pitch w:val="variable"/>
+    <w:sig w:usb0="E4002EFF" w:usb1="C200247B" w:usb2="00000009" w:usb3="00000000" w:csb0="000001FF" w:csb1="00000000"/>
+  </w:font>
+  <w:font w:name="Times New Roman">
+    <w:panose1 w:val="02020603050405020304"/>
+    <w:charset w:val="00"/>
+    <w:family w:val="roman"/>
+    <w:pitch w:val="variable"/>
+    <w:sig w:usb0="E0002EFF" w:usb1="C000785B" w:usb2="00000009" w:usb3="00000000" w:csb0="000001FF" w:csb1="00000000"/>
+  </w:font>
+  <w:font w:name="Aptos Display">
+    <w:charset w:val="00"/>
+    <w:family w:val="swiss"/>
+    <w:pitch w:val="variable"/>
+    <w:sig w:usb0="20000287" w:usb1="00000003" w:usb2="00000000" w:usb3="00000000" w:csb0="0000019F" w:csb1="00000000"/>
+  </w:font>
+  <w:font w:name="Aptos">
+    <w:charset w:val="00"/>
+    <w:family w:val="swiss"/>
+    <w:pitch w:val="variable"/>
+    <w:sig w:usb0="20000287" w:usb1="00000003" w:usb2="00000000" w:usb3="00000000" w:csb0="0000019F" w:csb1="00000000"/>
+  </w:font>
+</w:fonts>
+</file>
+
+<file path=word\footer1.xml><?xml version="1.0" encoding="utf-8"?>
 <w:ftr xmlns:wpc="http://schemas.microsoft.com/office/word/2010/wordprocessingCanvas" xmlns:cx="http://schemas.microsoft.com/office/drawing/2014/chartex" xmlns:cx1="http://schemas.microsoft.com/office/drawing/2015/9/8/chartex" xmlns:cx2="http://schemas.microsoft.com/office/drawing/2015/10/21/chartex" xmlns:cx3="http://schemas.microsoft.com/office/drawing/2016/5/9/chartex" xmlns:cx4="http://schemas.microsoft.com/office/drawing/2016/5/10/chartex" xmlns:cx5="http://schemas.microsoft.com/office/drawing/2016/5/11/chartex" xmlns:cx6="http://schemas.microsoft.com/office/drawing/2016/5/12/chartex" xmlns:cx7="http://schemas.microsoft.com/office/drawing/2016/5/13/chartex" xmlns:cx8="http://schemas.microsoft.com/office/drawing/2016/5/14/chartex" xmlns:mc="http://schemas.openxmlformats.org/markup-compatibility/2006" xmlns:aink="http://schemas.microsoft.com/office/drawing/2016/ink" xmlns:am3d="http://schemas.microsoft.com/office/drawing/2017/model3d" xmlns:o="urn:schemas-microsoft-com:office:office" xmlns:oel="http://schemas.microsoft.com/office/2019/extlst" xmlns:r="http://schemas.openxmlformats.org/officeDocument/2006/relationships" xmlns:m="http://schemas.openxmlformats.org/officeDocument/2006/math" xmlns:v="urn:schemas-microsoft-com:vml" xmlns:wp14="http://schemas.microsoft.com/office/word/2010/wordprocessingDrawing" xmlns:wp="http://schemas.openxmlformats.org/drawingml/2006/wordprocessingDrawing" xmlns:w10="urn:schemas-microsoft-com:office:word" xmlns:w="http://schemas.openxmlformats.org/wordprocessingml/2006/main" xmlns:w14="http://schemas.microsoft.com/office/word/2010/wordml" xmlns:w15="http://schemas.microsoft.com/office/word/2012/wordml" xmlns:w16cei="http://schemas.microsoft.com/office/word/2026/wordml/cei" xmlns:w16cex="http://schemas.microsoft.com/office/word/2018/wordml/cex" xmlns:w16cid="http://schemas.microsoft.com/office/word/2016/wordml/cid" xmlns:w16="http://schemas.microsoft.com/office/word/2018/wordml" xmlns:w16du="http://schemas.microsoft.com/office/word/2023/wordml/word16du" xmlns:w16sdtdh="http://schemas.microsoft.com/office/word/2020/wordml/sdtdatahash" xmlns:w16sdtfl="http://schemas.microsoft.com/office/word/2024/wordml/sdtformatlock" xmlns:w16se="http://schemas.microsoft.com/office/word/2015/wordml/symex" xmlns:wpg="http://schemas.microsoft.com/office/word/2010/wordprocessingGroup" xmlns:wpi="http://schemas.microsoft.com/office/word/2010/wordprocessingInk" xmlns:wne="http://schemas.microsoft.com/office/word/2006/wordml" xmlns:wps="http://schemas.microsoft.com/office/word/2010/wordprocessingShape" mc:Ignorable="w14 w15 w16se w16cid w16 w16cex w16sdtdh w16sdtfl w16du wp14">
   <w:p>
     <w:pPr>
@@ -1495,7 +1557,7 @@
 </w:ftr>
 </file>
 
-<file path=word/footnotes.xml><?xml version="1.0" encoding="utf-8"?>
+<file path=word\footnotes.xml><?xml version="1.0" encoding="utf-8"?>
 <w:footnotes xmlns:wpc="http://schemas.microsoft.com/office/word/2010/wordprocessingCanvas" xmlns:cx="http://schemas.microsoft.com/office/drawing/2014/chartex" xmlns:cx1="http://schemas.microsoft.com/office/drawing/2015/9/8/chartex" xmlns:cx2="http://schemas.microsoft.com/office/drawing/2015/10/21/chartex" xmlns:cx3="http://schemas.microsoft.com/office/drawing/2016/5/9/chartex" xmlns:cx4="http://schemas.microsoft.com/office/drawing/2016/5/10/chartex" xmlns:cx5="http://schemas.microsoft.com/office/drawing/2016/5/11/chartex" xmlns:cx6="http://schemas.microsoft.com/office/drawing/2016/5/12/chartex" xmlns:cx7="http://schemas.microsoft.com/office/drawing/2016/5/13/chartex" xmlns:cx8="http://schemas.microsoft.com/office/drawing/2016/5/14/chartex" xmlns:mc="http://schemas.openxmlformats.org/markup-compatibility/2006" xmlns:aink="http://schemas.microsoft.com/office/drawing/2016/ink" xmlns:am3d="http://schemas.microsoft.com/office/drawing/2017/model3d" xmlns:o="urn:schemas-microsoft-com:office:office" xmlns:oel="http://schemas.microsoft.com/office/2019/extlst" xmlns:r="http://schemas.openxmlformats.org/officeDocument/2006/relationships" xmlns:m="http://schemas.openxmlformats.org/officeDocument/2006/math" xmlns:v="urn:schemas-microsoft-com:vml" xmlns:wp14="http://schemas.microsoft.com/office/word/2010/wordprocessingDrawing" xmlns:wp="http://schemas.openxmlformats.org/drawingml/2006/wordprocessingDrawing" xmlns:w10="urn:schemas-microsoft-com:office:word" xmlns:w="http://schemas.openxmlformats.org/wordprocessingml/2006/main" xmlns:w14="http://schemas.microsoft.com/office/word/2010/wordml" xmlns:w15="http://schemas.microsoft.com/office/word/2012/wordml" xmlns:w16cei="http://schemas.microsoft.com/office/word/2026/wordml/cei" xmlns:w16cex="http://schemas.microsoft.com/office/word/2018/wordml/cex" xmlns:w16cid="http://schemas.microsoft.com/office/word/2016/wordml/cid" xmlns:w16="http://schemas.microsoft.com/office/word/2018/wordml" xmlns:w16du="http://schemas.microsoft.com/office/word/2023/wordml/word16du" xmlns:w16sdtdh="http://schemas.microsoft.com/office/word/2020/wordml/sdtdatahash" xmlns:w16sdtfl="http://schemas.microsoft.com/office/word/2024/wordml/sdtformatlock" xmlns:w16se="http://schemas.microsoft.com/office/word/2015/wordml/symex" xmlns:wpg="http://schemas.microsoft.com/office/word/2010/wordprocessingGroup" xmlns:wpi="http://schemas.microsoft.com/office/word/2010/wordprocessingInk" xmlns:wne="http://schemas.microsoft.com/office/word/2006/wordml" xmlns:wps="http://schemas.microsoft.com/office/word/2010/wordprocessingShape" mc:Ignorable="w14 w15 w16se w16cid w16 w16cex w16sdtdh w16sdtfl w16du wp14">
   <w:footnote w:type="separator" w:id="-1">
     <w:p>
@@ -1514,7 +1576,7 @@
 </w:footnotes>
 </file>
 
-<file path=word/numbering.xml><?xml version="1.0" encoding="utf-8"?>
+<file path=word\numbering.xml><?xml version="1.0" encoding="utf-8"?>
 <w:numbering xmlns:wpc="http://schemas.microsoft.com/office/word/2010/wordprocessingCanvas" xmlns:cx="http://schemas.microsoft.com/office/drawing/2014/chartex" xmlns:cx1="http://schemas.microsoft.com/office/drawing/2015/9/8/chartex" xmlns:cx2="http://schemas.microsoft.com/office/drawing/2015/10/21/chartex" xmlns:cx3="http://schemas.microsoft.com/office/drawing/2016/5/9/chartex" xmlns:cx4="http://schemas.microsoft.com/office/drawing/2016/5/10/chartex" xmlns:cx5="http://schemas.microsoft.com/office/drawing/2016/5/11/chartex" xmlns:cx6="http://schemas.microsoft.com/office/drawing/2016/5/12/chartex" xmlns:cx7="http://schemas.microsoft.com/office/drawing/2016/5/13/chartex" xmlns:cx8="http://schemas.microsoft.com/office/drawing/2016/5/14/chartex" xmlns:mc="http://schemas.openxmlformats.org/markup-compatibility/2006" xmlns:aink="http://schemas.microsoft.com/office/drawing/2016/ink" xmlns:am3d="http://schemas.microsoft.com/office/drawing/2017/model3d" xmlns:o="urn:schemas-microsoft-com:office:office" xmlns:oel="http://schemas.microsoft.com/office/2019/extlst" xmlns:r="http://schemas.openxmlformats.org/officeDocument/2006/relationships" xmlns:m="http://schemas.openxmlformats.org/officeDocument/2006/math" xmlns:v="urn:schemas-microsoft-com:vml" xmlns:wp14="http://schemas.microsoft.com/office/word/2010/wordprocessingDrawing" xmlns:wp="http://schemas.openxmlformats.org/drawingml/2006/wordprocessingDrawing" xmlns:w10="urn:schemas-microsoft-com:office:word" xmlns:w="http://schemas.openxmlformats.org/wordprocessingml/2006/main" xmlns:w14="http://schemas.microsoft.com/office/word/2010/wordml" xmlns:w15="http://schemas.microsoft.com/office/word/2012/wordml" xmlns:w16cei="http://schemas.microsoft.com/office/word/2026/wordml/cei" xmlns:w16cex="http://schemas.microsoft.com/office/word/2018/wordml/cex" xmlns:w16cid="http://schemas.microsoft.com/office/word/2016/wordml/cid" xmlns:w16="http://schemas.microsoft.com/office/word/2018/wordml" xmlns:w16du="http://schemas.microsoft.com/office/word/2023/wordml/word16du" xmlns:w16sdtdh="http://schemas.microsoft.com/office/word/2020/wordml/sdtdatahash" xmlns:w16sdtfl="http://schemas.microsoft.com/office/word/2024/wordml/sdtformatlock" xmlns:w16se="http://schemas.microsoft.com/office/word/2015/wordml/symex" xmlns:wpg="http://schemas.microsoft.com/office/word/2010/wordprocessingGroup" xmlns:wpi="http://schemas.microsoft.com/office/word/2010/wordprocessingInk" xmlns:wne="http://schemas.microsoft.com/office/word/2006/wordml" xmlns:wps="http://schemas.microsoft.com/office/word/2010/wordprocessingShape" mc:Ignorable="w14 w15 w16se w16cid w16 w16cex w16sdtdh w16sdtfl w16du wp14">
   <w:abstractNum w:abstractNumId="0" w15:restartNumberingAfterBreak="0">
     <w:nsid w:val="490047FD"/>
@@ -1731,7 +1793,65 @@
 </w:numbering>
 </file>
 
-<file path=word/styles.xml><?xml version="1.0" encoding="utf-8"?>
+<file path=word\settings.xml><?xml version="1.0" encoding="utf-8"?>
+<w:settings xmlns:mc="http://schemas.openxmlformats.org/markup-compatibility/2006" xmlns:o="urn:schemas-microsoft-com:office:office" xmlns:r="http://schemas.openxmlformats.org/officeDocument/2006/relationships" xmlns:m="http://schemas.openxmlformats.org/officeDocument/2006/math" xmlns:v="urn:schemas-microsoft-com:vml" xmlns:w10="urn:schemas-microsoft-com:office:word" xmlns:w="http://schemas.openxmlformats.org/wordprocessingml/2006/main" xmlns:w14="http://schemas.microsoft.com/office/word/2010/wordml" xmlns:w15="http://schemas.microsoft.com/office/word/2012/wordml" xmlns:w16cex="http://schemas.microsoft.com/office/word/2018/wordml/cex" xmlns:w16cid="http://schemas.microsoft.com/office/word/2016/wordml/cid" xmlns:w16="http://schemas.microsoft.com/office/word/2018/wordml" xmlns:w16du="http://schemas.microsoft.com/office/word/2023/wordml/word16du" xmlns:w16sdtdh="http://schemas.microsoft.com/office/word/2020/wordml/sdtdatahash" xmlns:w16sdtfl="http://schemas.microsoft.com/office/word/2024/wordml/sdtformatlock" xmlns:w16se="http://schemas.microsoft.com/office/word/2015/wordml/symex" xmlns:sl="http://schemas.openxmlformats.org/schemaLibrary/2006/main" mc:Ignorable="w14 w15 w16se w16cid w16 w16cex w16sdtdh w16sdtfl w16du">
+  <w:zoom w:percent="100"/>
+  <w:displayBackgroundShape/>
+  <w:proofState w:spelling="clean" w:grammar="clean"/>
+  <w:defaultTabStop w:val="720"/>
+  <w:characterSpacingControl w:val="doNotCompress"/>
+  <w:footnotePr>
+    <w:footnote w:id="-1"/>
+    <w:footnote w:id="0"/>
+  </w:footnotePr>
+  <w:endnotePr>
+    <w:endnote w:id="-1"/>
+    <w:endnote w:id="0"/>
+  </w:endnotePr>
+  <w:compat>
+    <w:compatSetting w:name="compatibilityMode" w:uri="http://schemas.microsoft.com/office/word" w:val="15"/>
+    <w:compatSetting w:name="overrideTableStyleFontSizeAndJustification" w:uri="http://schemas.microsoft.com/office/word" w:val="1"/>
+    <w:compatSetting w:name="enableOpenTypeFeatures" w:uri="http://schemas.microsoft.com/office/word" w:val="1"/>
+    <w:compatSetting w:name="doNotFlipMirrorIndents" w:uri="http://schemas.microsoft.com/office/word" w:val="1"/>
+    <w:compatSetting w:name="differentiateMultirowTableHeaders" w:uri="http://schemas.microsoft.com/office/word" w:val="1"/>
+    <w:compatSetting w:name="useWord2013TrackBottomHyphenation" w:uri="http://schemas.microsoft.com/office/word" w:val="1"/>
+  </w:compat>
+  <w:rsids>
+    <w:rsidRoot w:val="00013741"/>
+    <w:rsid w:val="00013741"/>
+    <w:rsid w:val="005959E8"/>
+    <w:rsid w:val="00AA440A"/>
+    <w:rsid w:val="00AE2843"/>
+  </w:rsids>
+  <m:mathPr>
+    <m:mathFont m:val="Cambria Math"/>
+    <m:brkBin m:val="before"/>
+    <m:brkBinSub m:val="--"/>
+    <m:smallFrac m:val="0"/>
+    <m:dispDef/>
+    <m:lMargin m:val="0"/>
+    <m:rMargin m:val="0"/>
+    <m:defJc m:val="centerGroup"/>
+    <m:wrapIndent m:val="1440"/>
+    <m:intLim m:val="subSup"/>
+    <m:naryLim m:val="undOvr"/>
+  </m:mathPr>
+  <w:themeFontLang w:val="en-PH"/>
+  <w:clrSchemeMapping w:bg1="light1" w:t1="dark1" w:bg2="light2" w:t2="dark2" w:accent1="accent1" w:accent2="accent2" w:accent3="accent3" w:accent4="accent4" w:accent5="accent5" w:accent6="accent6" w:hyperlink="hyperlink" w:followedHyperlink="followedHyperlink"/>
+  <w:shapeDefaults>
+    <o:shapedefaults v:ext="edit" spidmax="1026"/>
+    <o:shapelayout v:ext="edit">
+      <o:idmap v:ext="edit" data="1"/>
+    </o:shapelayout>
+  </w:shapeDefaults>
+  <w:decimalSymbol w:val="."/>
+  <w:listSeparator w:val=","/>
+  <w14:docId w14:val="6887C0EF"/>
+  <w15:docId w15:val="{42893A7E-CEA1-4622-BBC1-8615746A022A}"/>
+</w:settings>
+</file>
+
+<file path=word\styles.xml><?xml version="1.0" encoding="utf-8"?>
 <w:styles xmlns:mc="http://schemas.openxmlformats.org/markup-compatibility/2006" xmlns:r="http://schemas.openxmlformats.org/officeDocument/2006/relationships" xmlns:w="http://schemas.openxmlformats.org/wordprocessingml/2006/main" xmlns:w14="http://schemas.microsoft.com/office/word/2010/wordml" xmlns:w15="http://schemas.microsoft.com/office/word/2012/wordml" xmlns:w16cex="http://schemas.microsoft.com/office/word/2018/wordml/cex" xmlns:w16cid="http://schemas.microsoft.com/office/word/2016/wordml/cid" xmlns:w16="http://schemas.microsoft.com/office/word/2018/wordml" xmlns:w16du="http://schemas.microsoft.com/office/word/2023/wordml/word16du" xmlns:w16sdtdh="http://schemas.microsoft.com/office/word/2020/wordml/sdtdatahash" xmlns:w16sdtfl="http://schemas.microsoft.com/office/word/2024/wordml/sdtformatlock" xmlns:w16se="http://schemas.microsoft.com/office/word/2015/wordml/symex" mc:Ignorable="w14 w15 w16se w16cid w16 w16cex w16sdtdh w16sdtfl w16du">
   <w:docDefaults>
     <w:rPrDefault>
@@ -2332,7 +2452,7 @@
 </w:styles>
 </file>
 
-<file path=word/theme/theme1.xml><?xml version="1.0" encoding="utf-8"?>
+<file path=word\theme\theme1.xml><?xml version="1.0" encoding="utf-8"?>
 <a:theme xmlns:a="http://schemas.openxmlformats.org/drawingml/2006/main" name="Office Theme">
   <a:themeElements>
     <a:clrScheme name="Office">
@@ -2645,4 +2765,8 @@
     </a:ext>
   </a:extLst>
 </a:theme>
+</file>
+
+<file path=word\webSettings.xml><?xml version="1.0" encoding="utf-8"?>
+<w:webSettings xmlns:mc="http://schemas.openxmlformats.org/markup-compatibility/2006" xmlns:r="http://schemas.openxmlformats.org/officeDocument/2006/relationships" xmlns:w="http://schemas.openxmlformats.org/wordprocessingml/2006/main" xmlns:w14="http://schemas.microsoft.com/office/word/2010/wordml" xmlns:w15="http://schemas.microsoft.com/office/word/2012/wordml" xmlns:w16cex="http://schemas.microsoft.com/office/word/2018/wordml/cex" xmlns:w16cid="http://schemas.microsoft.com/office/word/2016/wordml/cid" xmlns:w16="http://schemas.microsoft.com/office/word/2018/wordml" xmlns:w16du="http://schemas.microsoft.com/office/word/2023/wordml/word16du" xmlns:w16sdtdh="http://schemas.microsoft.com/office/word/2020/wordml/sdtdatahash" xmlns:w16sdtfl="http://schemas.microsoft.com/office/word/2024/wordml/sdtformatlock" xmlns:w16se="http://schemas.microsoft.com/office/word/2015/wordml/symex" mc:Ignorable="w14 w15 w16se w16cid w16 w16cex w16sdtdh w16sdtfl w16du"/>
 </file>
</xml_diff>

<commit_message>
Update CV and portfolio tools: six tools, HSM, TVM, Spare Usage, Fleet Map
</commit_message>
<xml_diff>
--- a/public/cv/Romeo_David_Jr_CV_Final_ATS.docx
+++ b/public/cv/Romeo_David_Jr_CV_Final_ATS.docx
@@ -1,37 +1,6 @@
 
-<file path=docProps\app.xml><?xml version="1.0" encoding="utf-8"?>
-<Properties xmlns="http://schemas.openxmlformats.org/officeDocument/2006/extended-properties" xmlns:vt="http://schemas.openxmlformats.org/officeDocument/2006/docPropsVTypes">
-  <Template>Normal</Template>
-  <TotalTime>1</TotalTime>
-  <Pages>2</Pages>
-  <Words>946</Words>
-  <Characters>5395</Characters>
-  <Application>Microsoft Office Word</Application>
-  <DocSecurity>0</DocSecurity>
-  <Lines>44</Lines>
-  <Paragraphs>12</Paragraphs>
-  <ScaleCrop>false</ScaleCrop>
-  <Company/>
-  <LinksUpToDate>false</LinksUpToDate>
-  <CharactersWithSpaces>6329</CharactersWithSpaces>
-  <SharedDoc>false</SharedDoc>
-  <HyperlinksChanged>false</HyperlinksChanged>
-  <AppVersion>16.0000</AppVersion>
-</Properties>
-</file>
-
-<file path=docProps\core.xml><?xml version="1.0" encoding="utf-8"?>
-<cp:coreProperties xmlns:cp="http://schemas.openxmlformats.org/package/2006/metadata/core-properties" xmlns:dc="http://purl.org/dc/elements/1.1/" xmlns:dcterms="http://purl.org/dc/terms/" xmlns:dcmitype="http://purl.org/dc/dcmitype/" xmlns:xsi="http://www.w3.org/2001/XMLSchema-instance">
-  <dc:creator>Un-named</dc:creator>
-  <cp:lastModifiedBy>A1863</cp:lastModifiedBy>
-  <cp:revision>2</cp:revision>
-  <dcterms:created xsi:type="dcterms:W3CDTF">2026-07-23T11:54:00Z</dcterms:created>
-  <dcterms:modified xsi:type="dcterms:W3CDTF">2026-07-23T11:56:00Z</dcterms:modified>
-</cp:coreProperties>
-</file>
-
-<file path=word\document.xml><?xml version="1.0" encoding="utf-8"?>
-<w:document xmlns:wpc="http://schemas.microsoft.com/office/word/2010/wordprocessingCanvas" xmlns:cx="http://schemas.microsoft.com/office/drawing/2014/chartex" xmlns:cx1="http://schemas.microsoft.com/office/drawing/2015/9/8/chartex" xmlns:cx2="http://schemas.microsoft.com/office/drawing/2015/10/21/chartex" xmlns:cx3="http://schemas.microsoft.com/office/drawing/2016/5/9/chartex" xmlns:cx4="http://schemas.microsoft.com/office/drawing/2016/5/10/chartex" xmlns:cx5="http://schemas.microsoft.com/office/drawing/2016/5/11/chartex" xmlns:cx6="http://schemas.microsoft.com/office/drawing/2016/5/12/chartex" xmlns:cx7="http://schemas.microsoft.com/office/drawing/2016/5/13/chartex" xmlns:cx8="http://schemas.microsoft.com/office/drawing/2016/5/14/chartex" xmlns:mc="http://schemas.openxmlformats.org/markup-compatibility/2006" xmlns:aink="http://schemas.microsoft.com/office/drawing/2016/ink" xmlns:am3d="http://schemas.microsoft.com/office/drawing/2017/model3d" xmlns:o="urn:schemas-microsoft-com:office:office" xmlns:oel="http://schemas.microsoft.com/office/2019/extlst" xmlns:r="http://schemas.openxmlformats.org/officeDocument/2006/relationships" xmlns:m="http://schemas.openxmlformats.org/officeDocument/2006/math" xmlns:v="urn:schemas-microsoft-com:vml" xmlns:wp14="http://schemas.microsoft.com/office/word/2010/wordprocessingDrawing" xmlns:wp="http://schemas.openxmlformats.org/drawingml/2006/wordprocessingDrawing" xmlns:w10="urn:schemas-microsoft-com:office:word" xmlns:w="http://schemas.openxmlformats.org/wordprocessingml/2006/main" xmlns:w14="http://schemas.microsoft.com/office/word/2010/wordml" xmlns:w15="http://schemas.microsoft.com/office/word/2012/wordml" xmlns:w16cei="http://schemas.microsoft.com/office/word/2026/wordml/cei" xmlns:w16cex="http://schemas.microsoft.com/office/word/2018/wordml/cex" xmlns:w16cid="http://schemas.microsoft.com/office/word/2016/wordml/cid" xmlns:w16="http://schemas.microsoft.com/office/word/2018/wordml" xmlns:w16du="http://schemas.microsoft.com/office/word/2023/wordml/word16du" xmlns:w16sdtdh="http://schemas.microsoft.com/office/word/2020/wordml/sdtdatahash" xmlns:w16sdtfl="http://schemas.microsoft.com/office/word/2024/wordml/sdtformatlock" xmlns:w16se="http://schemas.microsoft.com/office/word/2015/wordml/symex" xmlns:wpg="http://schemas.microsoft.com/office/word/2010/wordprocessingGroup" xmlns:wpi="http://schemas.microsoft.com/office/word/2010/wordprocessingInk" xmlns:wne="http://schemas.microsoft.com/office/word/2006/wordml" xmlns:wps="http://schemas.microsoft.com/office/word/2010/wordprocessingShape" mc:Ignorable="w14 w15 w16se w16cid w16 w16cex w16sdtdh w16sdtfl w16du wp14">
+<file path=word/document.xml><?xml version="1.0" encoding="utf-8"?>
+<w:document xmlns:wpc="http://schemas.microsoft.com/office/word/2010/wordprocessingCanvas" xmlns:cx="http://schemas.microsoft.com/office/drawing/2014/chartex" xmlns:cx1="http://schemas.microsoft.com/office/drawing/2015/9/8/chartex" xmlns:cx2="http://schemas.microsoft.com/office/drawing/2015/10/21/chartex" xmlns:cx3="http://schemas.microsoft.com/office/drawing/2016/5/9/chartex" xmlns:cx4="http://schemas.microsoft.com/office/drawing/2016/5/10/chartex" xmlns:cx5="http://schemas.microsoft.com/office/drawing/2016/5/11/chartex" xmlns:cx6="http://schemas.microsoft.com/office/drawing/2016/5/12/chartex" xmlns:cx7="http://schemas.microsoft.com/office/drawing/2016/5/13/chartex" xmlns:cx8="http://schemas.microsoft.com/office/drawing/2016/5/14/chartex" xmlns:mc="http://schemas.openxmlformats.org/markup-compatibility/2006" xmlns:aink="http://schemas.microsoft.com/office/drawing/2016/ink" xmlns:am3d="http://schemas.microsoft.com/office/drawing/2017/model3d" xmlns:o="urn:schemas-microsoft-com:office:office" xmlns:oel="http://schemas.microsoft.com/office/2019/extlst" xmlns:r="http://schemas.openxmlformats.org/officeDocument/2006/relationships" xmlns:m="http://schemas.openxmlformats.org/officeDocument/2006/math" xmlns:v="urn:schemas-microsoft-com:vml" xmlns:wp14="http://schemas.microsoft.com/office/word/2010/wordprocessingDrawing" xmlns:wp="http://schemas.openxmlformats.org/drawingml/2006/wordprocessingDrawing" xmlns:w10="urn:schemas-microsoft-com:office:word" xmlns:w="http://schemas.openxmlformats.org/wordprocessingml/2006/main" xmlns:w14="http://schemas.microsoft.com/office/word/2010/wordml" xmlns:w15="http://schemas.microsoft.com/office/word/2012/wordml" xmlns:w16cex="http://schemas.microsoft.com/office/word/2018/wordml/cex" xmlns:w16cid="http://schemas.microsoft.com/office/word/2016/wordml/cid" xmlns:w16="http://schemas.microsoft.com/office/word/2018/wordml" xmlns:w16du="http://schemas.microsoft.com/office/word/2023/wordml/word16du" xmlns:w16sdtdh="http://schemas.microsoft.com/office/word/2020/wordml/sdtdatahash" xmlns:w16sdtfl="http://schemas.microsoft.com/office/word/2024/wordml/sdtformatlock" xmlns:w16se="http://schemas.microsoft.com/office/word/2015/wordml/symex" xmlns:wpg="http://schemas.microsoft.com/office/word/2010/wordprocessingGroup" xmlns:wpi="http://schemas.microsoft.com/office/word/2010/wordprocessingInk" xmlns:wne="http://schemas.microsoft.com/office/word/2006/wordml" xmlns:wps="http://schemas.microsoft.com/office/word/2010/wordprocessingShape" mc:Ignorable="w14 w15 w16se w16cid w16 w16cex w16sdtdh w16sdtfl w16du wp14">
   <w:body>
     <w:p>
       <w:pPr>
@@ -60,25 +29,7 @@
           <w:sz w:val="18"/>
           <w:szCs w:val="18"/>
         </w:rPr>
-        <w:t xml:space="preserve">Senior Telecommunications </w:t>
-      </w:r>
-      <w:proofErr w:type="gramStart"/>
-      <w:r>
-        <w:rPr>
-          <w:color w:val="2E75B6"/>
-          <w:sz w:val="18"/>
-          <w:szCs w:val="18"/>
-        </w:rPr>
-        <w:t>Engineer  |</w:t>
-      </w:r>
-      <w:proofErr w:type="gramEnd"/>
-      <w:r>
-        <w:rPr>
-          <w:color w:val="2E75B6"/>
-          <w:sz w:val="18"/>
-          <w:szCs w:val="18"/>
-        </w:rPr>
-        <w:t xml:space="preserve">  Data &amp; Automation Team Lead</w:t>
+        <w:t>Senior Telecommunications Engineer  |  Data &amp; Automation Team Lead</w:t>
       </w:r>
     </w:p>
     <w:p>
@@ -91,61 +42,20 @@
           <w:sz w:val="15"/>
           <w:szCs w:val="15"/>
         </w:rPr>
-        <w:t xml:space="preserve">Riyadh, Kingdom of Saudi </w:t>
-      </w:r>
-      <w:proofErr w:type="gramStart"/>
+        <w:t>Riyadh, Kingdom of Saudi Arabia  •  (+966) 505 290988  •  (+63) 929 7700859</w:t>
+      </w:r>
+    </w:p>
+    <w:p>
+      <w:pPr>
+        <w:spacing w:after="48"/>
+        <w:jc w:val="center"/>
+      </w:pPr>
       <w:r>
         <w:rPr>
           <w:sz w:val="15"/>
           <w:szCs w:val="15"/>
         </w:rPr>
-        <w:t>Arabia  •</w:t>
-      </w:r>
-      <w:proofErr w:type="gramEnd"/>
-      <w:r>
-        <w:rPr>
-          <w:sz w:val="15"/>
-          <w:szCs w:val="15"/>
-        </w:rPr>
-        <w:t xml:space="preserve">  (+966) 505 </w:t>
-      </w:r>
-      <w:proofErr w:type="gramStart"/>
-      <w:r>
-        <w:rPr>
-          <w:sz w:val="15"/>
-          <w:szCs w:val="15"/>
-        </w:rPr>
-        <w:t>290988  •</w:t>
-      </w:r>
-      <w:proofErr w:type="gramEnd"/>
-      <w:r>
-        <w:rPr>
-          <w:sz w:val="15"/>
-          <w:szCs w:val="15"/>
-        </w:rPr>
-        <w:t xml:space="preserve">  (+63) 929 7700859</w:t>
-      </w:r>
-    </w:p>
-    <w:p>
-      <w:pPr>
-        <w:spacing w:after="48"/>
-        <w:jc w:val="center"/>
-      </w:pPr>
-      <w:proofErr w:type="gramStart"/>
-      <w:r>
-        <w:rPr>
-          <w:sz w:val="15"/>
-          <w:szCs w:val="15"/>
-        </w:rPr>
-        <w:t>romeo_davidjr@yahoo.com  •</w:t>
-      </w:r>
-      <w:proofErr w:type="gramEnd"/>
-      <w:r>
-        <w:rPr>
-          <w:sz w:val="15"/>
-          <w:szCs w:val="15"/>
-        </w:rPr>
-        <w:t xml:space="preserve">  </w:t>
+        <w:t xml:space="preserve">romeo_davidjr@yahoo.com  •  </w:t>
       </w:r>
       <w:hyperlink r:id="rId7" w:history="1">
         <w:r>
@@ -155,9 +65,17 @@
             <w:szCs w:val="15"/>
             <w:u w:val="single"/>
           </w:rPr>
-          <w:t>linkedin.com/in/</w:t>
+          <w:t>linkedin.com/in/romeodavidjr</w:t>
         </w:r>
-        <w:proofErr w:type="spellStart"/>
+      </w:hyperlink>
+      <w:r>
+        <w:rPr>
+          <w:sz w:val="15"/>
+          <w:szCs w:val="15"/>
+        </w:rPr>
+        <w:t xml:space="preserve">  •  </w:t>
+      </w:r>
+      <w:hyperlink r:id="rId8" w:history="1">
         <w:r>
           <w:rPr>
             <w:color w:val="2E75B6"/>
@@ -165,49 +83,8 @@
             <w:szCs w:val="15"/>
             <w:u w:val="single"/>
           </w:rPr>
-          <w:t>romeodavidjr</w:t>
+          <w:t>romeo-david-portfolio.vercel.app</w:t>
         </w:r>
-        <w:proofErr w:type="spellEnd"/>
-      </w:hyperlink>
-      <w:r>
-        <w:rPr>
-          <w:sz w:val="15"/>
-          <w:szCs w:val="15"/>
-        </w:rPr>
-        <w:t xml:space="preserve">  •  </w:t>
-      </w:r>
-      <w:hyperlink r:id="rId8" w:history="1">
-        <w:proofErr w:type="spellStart"/>
-        <w:r>
-          <w:rPr>
-            <w:color w:val="2E75B6"/>
-            <w:sz w:val="15"/>
-            <w:szCs w:val="15"/>
-            <w:u w:val="single"/>
-          </w:rPr>
-          <w:t>romeo</w:t>
-        </w:r>
-        <w:proofErr w:type="spellEnd"/>
-        <w:r>
-          <w:rPr>
-            <w:color w:val="2E75B6"/>
-            <w:sz w:val="15"/>
-            <w:szCs w:val="15"/>
-            <w:u w:val="single"/>
-          </w:rPr>
-          <w:t>-david-</w:t>
-        </w:r>
-        <w:proofErr w:type="spellStart"/>
-        <w:r>
-          <w:rPr>
-            <w:color w:val="2E75B6"/>
-            <w:sz w:val="15"/>
-            <w:szCs w:val="15"/>
-            <w:u w:val="single"/>
-          </w:rPr>
-          <w:t>portfolio.vercel.app</w:t>
-        </w:r>
-        <w:proofErr w:type="spellEnd"/>
       </w:hyperlink>
     </w:p>
     <w:p>
@@ -236,10 +113,6 @@
       <w:r>
         <w:t>Senior Telecommunications Engineer with 19+ years of experience in multi-vendor network operations, project delivery, and operational automation. Currently leading O&amp;M for IDEMIA MestaFusion ATMS across 100+ sites in KSA Central Region, achieving 97.6% YTD SLA compliance with an average MTTR of 22.1 hours. Independently developed practical Python and PowerShell automation tools and Power BI dashboards that reduce daily data-processing time by 65–80%. Combines deep telecom expertise with Generative AI and Agentic AI-assisted development to deliver efficient, real-world solutions.</w:t>
       </w:r>
-      <w:proofErr w:type="spellStart"/>
-      <w:r/>
-      <w:proofErr w:type="spellEnd"/>
-      <w:r/>
     </w:p>
     <w:p>
       <w:pPr>
@@ -271,21 +144,8 @@
         </w:rPr>
         <w:t xml:space="preserve">Telecom Networks: </w:t>
       </w:r>
-      <w:proofErr w:type="gramStart"/>
-      <w:r>
-        <w:t>TETRA  •</w:t>
-      </w:r>
-      <w:proofErr w:type="gramEnd"/>
-      <w:r>
-        <w:t xml:space="preserve">  GSM/UMTS/</w:t>
-      </w:r>
-      <w:proofErr w:type="gramStart"/>
-      <w:r>
-        <w:t>LTE  •</w:t>
-      </w:r>
-      <w:proofErr w:type="gramEnd"/>
-      <w:r>
-        <w:t xml:space="preserve">  Microwave Transmission (Multi-vendor)</w:t>
+      <w:r>
+        <w:t>TETRA  •  GSM/UMTS/LTE  •  Microwave Transmission (Multi-vendor)</w:t>
       </w:r>
     </w:p>
     <w:p>
@@ -299,29 +159,8 @@
         </w:rPr>
         <w:t xml:space="preserve">Automation &amp; Analytics: </w:t>
       </w:r>
-      <w:proofErr w:type="gramStart"/>
-      <w:r>
-        <w:t>Python  •</w:t>
-      </w:r>
-      <w:proofErr w:type="gramEnd"/>
-      <w:r>
-        <w:t xml:space="preserve">  </w:t>
-      </w:r>
-      <w:proofErr w:type="gramStart"/>
-      <w:r>
-        <w:t>PowerShell  •</w:t>
-      </w:r>
-      <w:proofErr w:type="gramEnd"/>
-      <w:r>
-        <w:t xml:space="preserve">  Power BI </w:t>
-      </w:r>
-      <w:proofErr w:type="gramStart"/>
-      <w:r>
-        <w:t>Dashboards  •</w:t>
-      </w:r>
-      <w:proofErr w:type="gramEnd"/>
-      <w:r>
-        <w:t xml:space="preserve">  Generative AI &amp; Agentic AI-assisted Development</w:t>
+      <w:r>
+        <w:t>Python  •  PowerShell  •  Power BI Dashboards  •  Generative AI &amp; Agentic AI-assisted Development</w:t>
       </w:r>
     </w:p>
     <w:p>
@@ -336,31 +175,7 @@
         <w:t xml:space="preserve">Operations Excellence: </w:t>
       </w:r>
       <w:r>
-        <w:t xml:space="preserve">Site Surveys &amp; </w:t>
-      </w:r>
-      <w:proofErr w:type="gramStart"/>
-      <w:r>
-        <w:t>Audits  •</w:t>
-      </w:r>
-      <w:proofErr w:type="gramEnd"/>
-      <w:r>
-        <w:t xml:space="preserve">  Firmware </w:t>
-      </w:r>
-      <w:proofErr w:type="gramStart"/>
-      <w:r>
-        <w:t>Testing  •</w:t>
-      </w:r>
-      <w:proofErr w:type="gramEnd"/>
-      <w:r>
-        <w:t xml:space="preserve">  SLA </w:t>
-      </w:r>
-      <w:proofErr w:type="gramStart"/>
-      <w:r>
-        <w:t>Management  •</w:t>
-      </w:r>
-      <w:proofErr w:type="gramEnd"/>
-      <w:r>
-        <w:t xml:space="preserve">  Cross-regional Coordination</w:t>
+        <w:t>Site Surveys &amp; Audits  •  Firmware Testing  •  SLA Management  •  Cross-regional Coordination</w:t>
       </w:r>
     </w:p>
     <w:p>
@@ -375,23 +190,7 @@
         <w:t xml:space="preserve">Leadership: </w:t>
       </w:r>
       <w:r>
-        <w:t xml:space="preserve">Team &amp; Sector </w:t>
-      </w:r>
-      <w:proofErr w:type="gramStart"/>
-      <w:r>
-        <w:t>Lead  •</w:t>
-      </w:r>
-      <w:proofErr w:type="gramEnd"/>
-      <w:r>
-        <w:t xml:space="preserve">  Project </w:t>
-      </w:r>
-      <w:proofErr w:type="gramStart"/>
-      <w:r>
-        <w:t>Supervision  •</w:t>
-      </w:r>
-      <w:proofErr w:type="gramEnd"/>
-      <w:r>
-        <w:t xml:space="preserve">  Stakeholder Communication</w:t>
+        <w:t>Team &amp; Sector Lead  •  Project Supervision  •  Stakeholder Communication</w:t>
       </w:r>
     </w:p>
     <w:p>
@@ -448,17 +247,7 @@
           <w:sz w:val="18"/>
           <w:szCs w:val="18"/>
         </w:rPr>
-        <w:t xml:space="preserve">Senior Telecom Engineer – Data &amp; Automation Team </w:t>
-      </w:r>
-      <w:proofErr w:type="gramStart"/>
-      <w:r>
-        <w:rPr>
-          <w:i/>
-          <w:iCs/>
-          <w:sz w:val="18"/>
-          <w:szCs w:val="18"/>
-        </w:rPr>
-        <w:t>Lead</w:t>
+        <w:t>Senior Telecom Engineer – Data &amp; Automation Team Lead</w:t>
       </w:r>
       <w:r>
         <w:rPr>
@@ -466,16 +255,7 @@
           <w:sz w:val="16"/>
           <w:szCs w:val="16"/>
         </w:rPr>
-        <w:t xml:space="preserve">  |</w:t>
-      </w:r>
-      <w:proofErr w:type="gramEnd"/>
-      <w:r>
-        <w:rPr>
-          <w:color w:val="555555"/>
-          <w:sz w:val="16"/>
-          <w:szCs w:val="16"/>
-        </w:rPr>
-        <w:t xml:space="preserve">  Riyadh, KSA</w:t>
+        <w:t xml:space="preserve">  |  Riyadh, KSA</w:t>
       </w:r>
     </w:p>
     <w:p>
@@ -488,15 +268,7 @@
         <w:spacing w:after="5"/>
       </w:pPr>
       <w:r>
-        <w:t xml:space="preserve">Lead O&amp;M for IDEMIA </w:t>
-      </w:r>
-      <w:proofErr w:type="spellStart"/>
-      <w:r>
-        <w:t>MestaFusion</w:t>
-      </w:r>
-      <w:proofErr w:type="spellEnd"/>
-      <w:r>
-        <w:t xml:space="preserve"> ATMS across KSA Central Region; oversee technical support and cross-regional collaboration for 100+ live traffic monitoring sites.</w:t>
+        <w:t>Lead O&amp;M for IDEMIA MestaFusion ATMS across KSA Central Region; oversee technical support and cross-regional collaboration for 100+ live traffic monitoring sites.</w:t>
       </w:r>
     </w:p>
     <w:p>
@@ -522,7 +294,7 @@
         <w:spacing w:after="5"/>
       </w:pPr>
       <w:r>
-        <w:t>Independently developed and actively use four custom automation tools that transformed daily ATMS operations:</w:t>
+        <w:t>Independently developed and actively use six custom automation tools that transformed daily ATMS operations:</w:t>
       </w:r>
     </w:p>
     <w:p>
@@ -536,10 +308,18 @@
       </w:pPr>
       <w:r>
         <w:rPr>
+          <w:b/>
           <w:sz w:val="18"/>
           <w:szCs w:val="18"/>
         </w:rPr>
-        <w:t>Traffic Data Analysis Tool – Processes traffic event XML files into daily/master CSV reports with geospatial analysis.</w:t>
+        <w:t>Traffic Data Analysis Tool</w:t>
+      </w:r>
+      <w:r>
+        <w:rPr>
+          <w:sz w:val="18"/>
+          <w:szCs w:val="18"/>
+        </w:rPr>
+        <w:t xml:space="preserve"> – Processes traffic event XML files into daily/master CSV reports with geospatial analysis.</w:t>
       </w:r>
     </w:p>
     <w:p>
@@ -550,13 +330,25 @@
           <w:numId w:val="3"/>
         </w:numPr>
         <w:spacing w:after="3"/>
-      </w:pPr>
-      <w:r>
         <w:rPr>
           <w:sz w:val="18"/>
           <w:szCs w:val="18"/>
         </w:rPr>
-        <w:t>Traffic Violation Manager (TVM) – Segregates violation data and media by site/type/lane; includes EXIF extraction, video playback, and Excel/PowerPoint exports.</w:t>
+      </w:pPr>
+      <w:r>
+        <w:rPr>
+          <w:b/>
+          <w:sz w:val="18"/>
+          <w:szCs w:val="18"/>
+        </w:rPr>
+        <w:t>Traffic Violation Manager (TVM)</w:t>
+      </w:r>
+      <w:r>
+        <w:rPr>
+          <w:sz w:val="18"/>
+          <w:szCs w:val="18"/>
+        </w:rPr>
+        <w:t xml:space="preserve"> – Simplifies case review by organizing violation files and media by site, type, and lane, with photo and video playback, EXIF verification, and Excel and one-page PDF reports.</w:t>
       </w:r>
     </w:p>
     <w:p>
@@ -567,13 +359,25 @@
           <w:numId w:val="3"/>
         </w:numPr>
         <w:spacing w:after="3"/>
-      </w:pPr>
-      <w:r>
         <w:rPr>
           <w:sz w:val="18"/>
           <w:szCs w:val="18"/>
         </w:rPr>
-        <w:t>Hardware Serial Manager (HSM) – Parses hardware configurations into searchable CSV inventory with duplicate detection.</w:t>
+      </w:pPr>
+      <w:r>
+        <w:rPr>
+          <w:b/>
+          <w:sz w:val="18"/>
+          <w:szCs w:val="18"/>
+        </w:rPr>
+        <w:t>Hardware Serial Manager (HSM)</w:t>
+      </w:r>
+      <w:r>
+        <w:rPr>
+          <w:sz w:val="18"/>
+          <w:szCs w:val="18"/>
+        </w:rPr>
+        <w:t xml:space="preserve"> – Scrapes cabinet serials into the inventory for easier tracking, then syncs the confirmed update to Drive without duplicate rows.</w:t>
       </w:r>
     </w:p>
     <w:p>
@@ -583,14 +387,66 @@
           <w:ilvl w:val="0"/>
           <w:numId w:val="3"/>
         </w:numPr>
-        <w:spacing w:after="5"/>
-      </w:pPr>
-      <w:r>
-        <w:rPr>
+        <w:spacing w:after="3"/>
+      </w:pPr>
+      <w:r>
+        <w:rPr>
+          <w:b/>
           <w:sz w:val="18"/>
           <w:szCs w:val="18"/>
         </w:rPr>
-        <w:t>SMART Drive Health Monitor – PowerShell-based field tool for remote SMART health monitoring of HDDs/SSDs via SSH; provides health recommendations and generates XML reports.</w:t>
+        <w:t>SMART Drive Health Monitor</w:t>
+      </w:r>
+      <w:r>
+        <w:rPr>
+          <w:sz w:val="18"/>
+          <w:szCs w:val="18"/>
+        </w:rPr>
+        <w:t xml:space="preserve"> – PowerShell-based field tool for remote SMART health monitoring of HDDs/SSDs via SSH; provides health recommendations and generates XML reports.</w:t>
+      </w:r>
+    </w:p>
+    <w:p>
+      <w:pPr>
+        <w:pStyle w:val="ListParagraph"/>
+        <w:numPr>
+          <w:ilvl w:val="0"/>
+          <w:numId w:val="3"/>
+        </w:numPr>
+        <w:spacing w:after="3"/>
+      </w:pPr>
+      <w:r>
+        <w:rPr>
+          <w:b/>
+          <w:sz w:val="18"/>
+          <w:szCs w:val="18"/>
+        </w:rPr>
+        <w:t>Spare Usage</w:t>
+      </w:r>
+      <w:r>
+        <w:rPr>
+          <w:sz w:val="18"/>
+          <w:szCs w:val="18"/>
+        </w:rPr>
+        <w:t xml:space="preserve"> – Tracks spare-parts usage by site for restoration, PMR, and special tasks, with filters by spare type and monthly usage reports.</w:t>
+      </w:r>
+    </w:p>
+    <w:p>
+      <w:pPr>
+        <w:pStyle w:val="ListParagraph"/>
+        <w:numPr>
+          <w:ilvl w:val="0"/>
+          <w:numId w:val="6"/>
+        </w:numPr>
+        <w:spacing w:after="3"/>
+      </w:pPr>
+      <w:r>
+        <w:rPr>
+          <w:b/>
+        </w:rPr>
+        <w:t>Fleet Map</w:t>
+      </w:r>
+      <w:r>
+        <w:t xml:space="preserve"> – Built a live map of the ATMS sites inside TicketFlow that works across different devices, with color-coded pins by ticket status, site thumbnails, and on-map weather with a 6-hour peek.</w:t>
       </w:r>
     </w:p>
     <w:p>
@@ -654,17 +510,7 @@
           <w:sz w:val="18"/>
           <w:szCs w:val="18"/>
         </w:rPr>
-        <w:t xml:space="preserve">Telecom Engineer / Transmission Specialist / Sector </w:t>
-      </w:r>
-      <w:proofErr w:type="gramStart"/>
-      <w:r>
-        <w:rPr>
-          <w:i/>
-          <w:iCs/>
-          <w:sz w:val="18"/>
-          <w:szCs w:val="18"/>
-        </w:rPr>
-        <w:t>Lead</w:t>
+        <w:t>Telecom Engineer / Transmission Specialist / Sector Lead</w:t>
       </w:r>
       <w:r>
         <w:rPr>
@@ -672,16 +518,7 @@
           <w:sz w:val="16"/>
           <w:szCs w:val="16"/>
         </w:rPr>
-        <w:t xml:space="preserve">  |</w:t>
-      </w:r>
-      <w:proofErr w:type="gramEnd"/>
-      <w:r>
-        <w:rPr>
-          <w:color w:val="555555"/>
-          <w:sz w:val="16"/>
-          <w:szCs w:val="16"/>
-        </w:rPr>
-        <w:t xml:space="preserve">  Riyadh, KSA</w:t>
+        <w:t xml:space="preserve">  |  Riyadh, KSA</w:t>
       </w:r>
     </w:p>
     <w:p>
@@ -696,29 +533,7 @@
           <w:sz w:val="15"/>
           <w:szCs w:val="15"/>
         </w:rPr>
-        <w:t xml:space="preserve">Joint Venture of AIRBUS </w:t>
-      </w:r>
-      <w:proofErr w:type="spellStart"/>
-      <w:r>
-        <w:rPr>
-          <w:i/>
-          <w:iCs/>
-          <w:color w:val="555555"/>
-          <w:sz w:val="15"/>
-          <w:szCs w:val="15"/>
-        </w:rPr>
-        <w:t>Defence</w:t>
-      </w:r>
-      <w:proofErr w:type="spellEnd"/>
-      <w:r>
-        <w:rPr>
-          <w:i/>
-          <w:iCs/>
-          <w:color w:val="555555"/>
-          <w:sz w:val="15"/>
-          <w:szCs w:val="15"/>
-        </w:rPr>
-        <w:t xml:space="preserve"> and Space and Saudi Technical Trading Cont. Co.</w:t>
+        <w:t>Joint Venture of AIRBUS Defence and Space and Saudi Technical Trading Cont. Co.</w:t>
       </w:r>
     </w:p>
     <w:p>
@@ -795,17 +610,7 @@
           <w:sz w:val="18"/>
           <w:szCs w:val="18"/>
         </w:rPr>
-        <w:t xml:space="preserve">Senior </w:t>
-      </w:r>
-      <w:proofErr w:type="gramStart"/>
-      <w:r>
-        <w:rPr>
-          <w:i/>
-          <w:iCs/>
-          <w:sz w:val="18"/>
-          <w:szCs w:val="18"/>
-        </w:rPr>
-        <w:t>Engineer</w:t>
+        <w:t>Senior Engineer</w:t>
       </w:r>
       <w:r>
         <w:rPr>
@@ -813,16 +618,7 @@
           <w:sz w:val="16"/>
           <w:szCs w:val="16"/>
         </w:rPr>
-        <w:t xml:space="preserve">  |</w:t>
-      </w:r>
-      <w:proofErr w:type="gramEnd"/>
-      <w:r>
-        <w:rPr>
-          <w:color w:val="555555"/>
-          <w:sz w:val="16"/>
-          <w:szCs w:val="16"/>
-        </w:rPr>
-        <w:t xml:space="preserve">  Philippines</w:t>
+        <w:t xml:space="preserve">  |  Philippines</w:t>
       </w:r>
     </w:p>
     <w:p>
@@ -899,17 +695,7 @@
           <w:sz w:val="18"/>
           <w:szCs w:val="18"/>
         </w:rPr>
-        <w:t xml:space="preserve">Junior Design Engineer / Team </w:t>
-      </w:r>
-      <w:proofErr w:type="gramStart"/>
-      <w:r>
-        <w:rPr>
-          <w:i/>
-          <w:iCs/>
-          <w:sz w:val="18"/>
-          <w:szCs w:val="18"/>
-        </w:rPr>
-        <w:t>Lead</w:t>
+        <w:t>Junior Design Engineer / Team Lead</w:t>
       </w:r>
       <w:r>
         <w:rPr>
@@ -917,16 +703,7 @@
           <w:sz w:val="16"/>
           <w:szCs w:val="16"/>
         </w:rPr>
-        <w:t xml:space="preserve">  |</w:t>
-      </w:r>
-      <w:proofErr w:type="gramEnd"/>
-      <w:r>
-        <w:rPr>
-          <w:color w:val="555555"/>
-          <w:sz w:val="16"/>
-          <w:szCs w:val="16"/>
-        </w:rPr>
-        <w:t xml:space="preserve">  Philippines</w:t>
+        <w:t xml:space="preserve">  |  Philippines</w:t>
       </w:r>
     </w:p>
     <w:p>
@@ -970,12 +747,11 @@
     </w:p>
     <w:p>
       <w:pPr>
+        <w:keepNext/>
         <w:pBdr>
           <w:bottom w:val="single" w:sz="12" w:space="1" w:color="1F4E79"/>
         </w:pBdr>
-        <w:spacing w:before="2" w:after="28"/>
-      </w:pPr>
-      <w:r>
+        <w:spacing w:after="28"/>
         <w:rPr>
           <w:b/>
           <w:bCs/>
@@ -984,49 +760,24 @@
           <w:sz w:val="18"/>
           <w:szCs w:val="18"/>
         </w:rPr>
-        <w:t>KEY PROJECT</w:t>
-      </w:r>
-    </w:p>
-    <w:p>
-      <w:pPr>
-        <w:spacing w:before="4" w:after="5"/>
-      </w:pPr>
-      <w:proofErr w:type="spellStart"/>
-      <w:r>
-        <w:rPr>
-          <w:b/>
-          <w:bCs/>
-        </w:rPr>
-        <w:t>TicketFlow</w:t>
-      </w:r>
-      <w:proofErr w:type="spellEnd"/>
-      <w:r>
-        <w:rPr>
-          <w:b/>
-          <w:bCs/>
-        </w:rPr>
-        <w:t xml:space="preserve"> – Field Engineer Ticket &amp; Restoration Management System (2026)</w:t>
-      </w:r>
-    </w:p>
-    <w:p>
-      <w:pPr>
-        <w:spacing w:after="12"/>
-      </w:pPr>
-      <w:r>
-        <w:t>Full-stack web application developed with Generative AI and Agentic AI assistance to automate O&amp;M ticket management for field engineers. Features include OCR-based ticket creation from photos, SLA tracking (24h/48h/72h) with color-coded status, automated Restoration Reports with evidence photos and digital signatures, real-time dashboard, and mobile access. Technologies: Python (Flask), HTML/CSS/JavaScript, OCR, SQLite, PDF generation.</w:t>
-      </w:r>
-    </w:p>
-    <w:p>
-      <w:r>
-        <w:br w:type="page"/>
-      </w:r>
-    </w:p>
-    <w:p>
-      <w:pPr>
+        <w:sectPr>
+          <w:footerReference w:type="default" r:id="rId9"/>
+          <w:pgSz w:w="12240" w:h="15840"/>
+          <w:pgMar w:top="500" w:right="580" w:bottom="500" w:left="580" w:header="708" w:footer="708" w:gutter="0"/>
+          <w:cols w:space="720"/>
+          <w:docGrid w:linePitch="360"/>
+        </w:sectPr>
+      </w:pPr>
+    </w:p>
+    <w:p>
+      <w:pPr>
+        <w:keepNext/>
         <w:pBdr>
           <w:bottom w:val="single" w:sz="12" w:space="1" w:color="1F4E79"/>
         </w:pBdr>
-        <w:spacing w:before="8" w:after="28"/>
+        <w:spacing w:after="28"/>
+      </w:pPr>
+      <w:r>
         <w:rPr>
           <w:b/>
           <w:bCs/>
@@ -1035,7 +786,39 @@
           <w:sz w:val="18"/>
           <w:szCs w:val="18"/>
         </w:rPr>
-      </w:pPr>
+        <w:lastRenderedPageBreak/>
+        <w:t>KEY PROJECT</w:t>
+      </w:r>
+    </w:p>
+    <w:p>
+      <w:pPr>
+        <w:keepNext/>
+        <w:keepLines/>
+        <w:spacing w:before="4" w:after="5"/>
+      </w:pPr>
+      <w:r>
+        <w:rPr>
+          <w:b/>
+          <w:bCs/>
+        </w:rPr>
+        <w:t>TicketFlow – Field Engineer Ticket &amp; Restoration Management System (2026)</w:t>
+      </w:r>
+    </w:p>
+    <w:p>
+      <w:pPr>
+        <w:spacing w:after="12"/>
+      </w:pPr>
+      <w:r>
+        <w:t>Full-stack web application developed with Generative AI and Agentic AI assistance to automate O&amp;M ticket management for field engineers. Features include OCR-based ticket creation from photos, SLA tracking (24h/48h/72h) with color-coded status, automated Restoration Reports with evidence photos and digital signatures, real-time dashboard, and mobile access.</w:t>
+      </w:r>
+    </w:p>
+    <w:p>
+      <w:pPr>
+        <w:spacing w:after="12"/>
+      </w:pPr>
+      <w:r>
+        <w:t>Technologies: Python (Flask), HTML/CSS/JavaScript, OCR, SQLite, PDF generation.</w:t>
+      </w:r>
     </w:p>
     <w:p>
       <w:pPr>
@@ -1043,6 +826,8 @@
           <w:bottom w:val="single" w:sz="12" w:space="1" w:color="1F4E79"/>
         </w:pBdr>
         <w:spacing w:before="8" w:after="28"/>
+      </w:pPr>
+      <w:r>
         <w:rPr>
           <w:b/>
           <w:bCs/>
@@ -1051,35 +836,17 @@
           <w:sz w:val="18"/>
           <w:szCs w:val="18"/>
         </w:rPr>
-      </w:pPr>
-    </w:p>
-    <w:p>
-      <w:pPr>
-        <w:pBdr>
-          <w:bottom w:val="single" w:sz="12" w:space="1" w:color="1F4E79"/>
-        </w:pBdr>
-        <w:spacing w:before="8" w:after="28"/>
+        <w:t>EDUCATION</w:t>
+      </w:r>
+    </w:p>
+    <w:p>
+      <w:pPr>
+        <w:spacing w:before="6" w:after="3"/>
       </w:pPr>
       <w:r>
         <w:rPr>
           <w:b/>
           <w:bCs/>
-          <w:caps/>
-          <w:color w:val="1F4E79"/>
-          <w:sz w:val="18"/>
-          <w:szCs w:val="18"/>
-        </w:rPr>
-        <w:t>EDUCATION</w:t>
-      </w:r>
-    </w:p>
-    <w:p>
-      <w:pPr>
-        <w:spacing w:before="6" w:after="3"/>
-      </w:pPr>
-      <w:r>
-        <w:rPr>
-          <w:b/>
-          <w:bCs/>
         </w:rPr>
         <w:t>Master of Science in Electronics &amp; Communications Engineering (Major in Control Systems)</w:t>
       </w:r>
@@ -1088,102 +855,38 @@
       <w:pPr>
         <w:spacing w:after="12"/>
       </w:pPr>
-      <w:proofErr w:type="spellStart"/>
       <w:r>
         <w:rPr>
           <w:color w:val="444444"/>
           <w:sz w:val="17"/>
           <w:szCs w:val="17"/>
         </w:rPr>
-        <w:t>Mapúa</w:t>
-      </w:r>
-      <w:proofErr w:type="spellEnd"/>
+        <w:t>Mapúa Institute of Technology, Philippines  •  Completed 31 graduate units  •  Emerson Process Management (EPM) Company Scholar</w:t>
+      </w:r>
+    </w:p>
+    <w:p>
+      <w:pPr>
+        <w:spacing w:before="6" w:after="3"/>
+      </w:pPr>
+      <w:r>
+        <w:rPr>
+          <w:b/>
+          <w:bCs/>
+        </w:rPr>
+        <w:t>Bachelor of Science in Electronics &amp; Communications Engineering</w:t>
+      </w:r>
+    </w:p>
+    <w:p>
+      <w:pPr>
+        <w:spacing w:after="34"/>
+      </w:pPr>
       <w:r>
         <w:rPr>
           <w:color w:val="444444"/>
           <w:sz w:val="17"/>
           <w:szCs w:val="17"/>
         </w:rPr>
-        <w:t xml:space="preserve"> Institute of Technology, </w:t>
-      </w:r>
-      <w:proofErr w:type="gramStart"/>
-      <w:r>
-        <w:rPr>
-          <w:color w:val="444444"/>
-          <w:sz w:val="17"/>
-          <w:szCs w:val="17"/>
-        </w:rPr>
-        <w:t>Philippines  •</w:t>
-      </w:r>
-      <w:proofErr w:type="gramEnd"/>
-      <w:r>
-        <w:rPr>
-          <w:color w:val="444444"/>
-          <w:sz w:val="17"/>
-          <w:szCs w:val="17"/>
-        </w:rPr>
-        <w:t xml:space="preserve">  Completed 31 graduate </w:t>
-      </w:r>
-      <w:proofErr w:type="gramStart"/>
-      <w:r>
-        <w:rPr>
-          <w:color w:val="444444"/>
-          <w:sz w:val="17"/>
-          <w:szCs w:val="17"/>
-        </w:rPr>
-        <w:t>units  •</w:t>
-      </w:r>
-      <w:proofErr w:type="gramEnd"/>
-      <w:r>
-        <w:rPr>
-          <w:color w:val="444444"/>
-          <w:sz w:val="17"/>
-          <w:szCs w:val="17"/>
-        </w:rPr>
-        <w:t xml:space="preserve">  Emerson Process Management (EPM) Company Scholar</w:t>
-      </w:r>
-    </w:p>
-    <w:p>
-      <w:pPr>
-        <w:spacing w:before="6" w:after="3"/>
-      </w:pPr>
-      <w:r>
-        <w:rPr>
-          <w:b/>
-          <w:bCs/>
-        </w:rPr>
-        <w:t>Bachelor of Science in Electronics &amp; Communications Engineering</w:t>
-      </w:r>
-    </w:p>
-    <w:p>
-      <w:pPr>
-        <w:spacing w:after="34"/>
-      </w:pPr>
-      <w:r>
-        <w:rPr>
-          <w:color w:val="444444"/>
-          <w:sz w:val="17"/>
-          <w:szCs w:val="17"/>
-        </w:rPr>
-        <w:t xml:space="preserve">Southern Luzon State University, </w:t>
-      </w:r>
-      <w:proofErr w:type="gramStart"/>
-      <w:r>
-        <w:rPr>
-          <w:color w:val="444444"/>
-          <w:sz w:val="17"/>
-          <w:szCs w:val="17"/>
-        </w:rPr>
-        <w:t>Philippines  •</w:t>
-      </w:r>
-      <w:proofErr w:type="gramEnd"/>
-      <w:r>
-        <w:rPr>
-          <w:color w:val="444444"/>
-          <w:sz w:val="17"/>
-          <w:szCs w:val="17"/>
-        </w:rPr>
-        <w:t xml:space="preserve">  DOST-SEI Scholar</w:t>
+        <w:t>Southern Luzon State University, Philippines  •  DOST-SEI Scholar</w:t>
       </w:r>
     </w:p>
     <w:p>
@@ -1228,15 +931,7 @@
         <w:spacing w:after="8"/>
       </w:pPr>
       <w:r>
-        <w:t xml:space="preserve">Conferred ASEAN Engineer (AE) — ASEAN Federation of Engineering </w:t>
-      </w:r>
-      <w:proofErr w:type="spellStart"/>
-      <w:r>
-        <w:t>Organisations</w:t>
-      </w:r>
-      <w:proofErr w:type="spellEnd"/>
-      <w:r>
-        <w:t xml:space="preserve"> (AFEO No. 7542)</w:t>
+        <w:t>Conferred ASEAN Engineer (AE) — ASEAN Federation of Engineering Organisations (AFEO No. 7542)</w:t>
       </w:r>
     </w:p>
     <w:p>
@@ -1275,15 +970,7 @@
         <w:spacing w:after="34"/>
       </w:pPr>
       <w:r>
-        <w:t xml:space="preserve">Certified General Security Professional (CGSP) – CCTV | </w:t>
-      </w:r>
-      <w:proofErr w:type="gramStart"/>
-      <w:r>
-        <w:t>Hikvision  •</w:t>
-      </w:r>
-      <w:proofErr w:type="gramEnd"/>
-      <w:r>
-        <w:t xml:space="preserve">  Valid: Dec 2025 – Dec 2030</w:t>
+        <w:t>Certified General Security Professional (CGSP) – CCTV | Hikvision  •  Valid: Dec 2025 – Dec 2030</w:t>
       </w:r>
     </w:p>
     <w:p>
@@ -1332,15 +1019,7 @@
         <w:t xml:space="preserve">Telecom &amp; OSS: </w:t>
       </w:r>
       <w:r>
-        <w:t>Ericsson (OSS-RC/</w:t>
-      </w:r>
-      <w:proofErr w:type="spellStart"/>
-      <w:r>
-        <w:t>WinFIOL</w:t>
-      </w:r>
-      <w:proofErr w:type="spellEnd"/>
-      <w:r>
-        <w:t>/OMT), Huawei BTS Site Maintenance Terminal, Nokia (MMI/BTS Manager), IDEMIA Fusion Manager</w:t>
+        <w:t>Ericsson (OSS-RC/WinFIOL/OMT), Huawei BTS Site Maintenance Terminal, Nokia (MMI/BTS Manager), IDEMIA Fusion Manager</w:t>
       </w:r>
     </w:p>
     <w:p>
@@ -1389,9 +1068,8 @@
       </w:r>
     </w:p>
     <w:sectPr>
-      <w:footerReference w:type="default" r:id="rId9"/>
       <w:pgSz w:w="12240" w:h="15840"/>
-      <w:pgMar w:top="500" w:right="580" w:bottom="500" w:left="580" w:header="708" w:footer="708" w:gutter="0"/>
+      <w:pgMar w:top="1220" w:right="580" w:bottom="500" w:left="580" w:header="708" w:footer="708" w:gutter="0"/>
       <w:cols w:space="720"/>
       <w:docGrid w:linePitch="360"/>
     </w:sectPr>
@@ -1399,8 +1077,8 @@
 </w:document>
 </file>
 
-<file path=word\endnotes.xml><?xml version="1.0" encoding="utf-8"?>
-<w:endnotes xmlns:wpc="http://schemas.microsoft.com/office/word/2010/wordprocessingCanvas" xmlns:cx="http://schemas.microsoft.com/office/drawing/2014/chartex" xmlns:cx1="http://schemas.microsoft.com/office/drawing/2015/9/8/chartex" xmlns:cx2="http://schemas.microsoft.com/office/drawing/2015/10/21/chartex" xmlns:cx3="http://schemas.microsoft.com/office/drawing/2016/5/9/chartex" xmlns:cx4="http://schemas.microsoft.com/office/drawing/2016/5/10/chartex" xmlns:cx5="http://schemas.microsoft.com/office/drawing/2016/5/11/chartex" xmlns:cx6="http://schemas.microsoft.com/office/drawing/2016/5/12/chartex" xmlns:cx7="http://schemas.microsoft.com/office/drawing/2016/5/13/chartex" xmlns:cx8="http://schemas.microsoft.com/office/drawing/2016/5/14/chartex" xmlns:mc="http://schemas.openxmlformats.org/markup-compatibility/2006" xmlns:aink="http://schemas.microsoft.com/office/drawing/2016/ink" xmlns:am3d="http://schemas.microsoft.com/office/drawing/2017/model3d" xmlns:o="urn:schemas-microsoft-com:office:office" xmlns:oel="http://schemas.microsoft.com/office/2019/extlst" xmlns:r="http://schemas.openxmlformats.org/officeDocument/2006/relationships" xmlns:m="http://schemas.openxmlformats.org/officeDocument/2006/math" xmlns:v="urn:schemas-microsoft-com:vml" xmlns:wp14="http://schemas.microsoft.com/office/word/2010/wordprocessingDrawing" xmlns:wp="http://schemas.openxmlformats.org/drawingml/2006/wordprocessingDrawing" xmlns:w10="urn:schemas-microsoft-com:office:word" xmlns:w="http://schemas.openxmlformats.org/wordprocessingml/2006/main" xmlns:w14="http://schemas.microsoft.com/office/word/2010/wordml" xmlns:w15="http://schemas.microsoft.com/office/word/2012/wordml" xmlns:w16cei="http://schemas.microsoft.com/office/word/2026/wordml/cei" xmlns:w16cex="http://schemas.microsoft.com/office/word/2018/wordml/cex" xmlns:w16cid="http://schemas.microsoft.com/office/word/2016/wordml/cid" xmlns:w16="http://schemas.microsoft.com/office/word/2018/wordml" xmlns:w16du="http://schemas.microsoft.com/office/word/2023/wordml/word16du" xmlns:w16sdtdh="http://schemas.microsoft.com/office/word/2020/wordml/sdtdatahash" xmlns:w16sdtfl="http://schemas.microsoft.com/office/word/2024/wordml/sdtformatlock" xmlns:w16se="http://schemas.microsoft.com/office/word/2015/wordml/symex" xmlns:wpg="http://schemas.microsoft.com/office/word/2010/wordprocessingGroup" xmlns:wpi="http://schemas.microsoft.com/office/word/2010/wordprocessingInk" xmlns:wne="http://schemas.microsoft.com/office/word/2006/wordml" xmlns:wps="http://schemas.microsoft.com/office/word/2010/wordprocessingShape" mc:Ignorable="w14 w15 w16se w16cid w16 w16cex w16sdtdh w16sdtfl w16du wp14">
+<file path=word/endnotes.xml><?xml version="1.0" encoding="utf-8"?>
+<w:endnotes xmlns:wpc="http://schemas.microsoft.com/office/word/2010/wordprocessingCanvas" xmlns:cx="http://schemas.microsoft.com/office/drawing/2014/chartex" xmlns:cx1="http://schemas.microsoft.com/office/drawing/2015/9/8/chartex" xmlns:cx2="http://schemas.microsoft.com/office/drawing/2015/10/21/chartex" xmlns:cx3="http://schemas.microsoft.com/office/drawing/2016/5/9/chartex" xmlns:cx4="http://schemas.microsoft.com/office/drawing/2016/5/10/chartex" xmlns:cx5="http://schemas.microsoft.com/office/drawing/2016/5/11/chartex" xmlns:cx6="http://schemas.microsoft.com/office/drawing/2016/5/12/chartex" xmlns:cx7="http://schemas.microsoft.com/office/drawing/2016/5/13/chartex" xmlns:cx8="http://schemas.microsoft.com/office/drawing/2016/5/14/chartex" xmlns:mc="http://schemas.openxmlformats.org/markup-compatibility/2006" xmlns:aink="http://schemas.microsoft.com/office/drawing/2016/ink" xmlns:am3d="http://schemas.microsoft.com/office/drawing/2017/model3d" xmlns:o="urn:schemas-microsoft-com:office:office" xmlns:oel="http://schemas.microsoft.com/office/2019/extlst" xmlns:r="http://schemas.openxmlformats.org/officeDocument/2006/relationships" xmlns:m="http://schemas.openxmlformats.org/officeDocument/2006/math" xmlns:v="urn:schemas-microsoft-com:vml" xmlns:wp14="http://schemas.microsoft.com/office/word/2010/wordprocessingDrawing" xmlns:wp="http://schemas.openxmlformats.org/drawingml/2006/wordprocessingDrawing" xmlns:w10="urn:schemas-microsoft-com:office:word" xmlns:w="http://schemas.openxmlformats.org/wordprocessingml/2006/main" xmlns:w14="http://schemas.microsoft.com/office/word/2010/wordml" xmlns:w15="http://schemas.microsoft.com/office/word/2012/wordml" xmlns:w16cex="http://schemas.microsoft.com/office/word/2018/wordml/cex" xmlns:w16cid="http://schemas.microsoft.com/office/word/2016/wordml/cid" xmlns:w16="http://schemas.microsoft.com/office/word/2018/wordml" xmlns:w16du="http://schemas.microsoft.com/office/word/2023/wordml/word16du" xmlns:w16sdtdh="http://schemas.microsoft.com/office/word/2020/wordml/sdtdatahash" xmlns:w16sdtfl="http://schemas.microsoft.com/office/word/2024/wordml/sdtformatlock" xmlns:w16se="http://schemas.microsoft.com/office/word/2015/wordml/symex" xmlns:wpg="http://schemas.microsoft.com/office/word/2010/wordprocessingGroup" xmlns:wpi="http://schemas.microsoft.com/office/word/2010/wordprocessingInk" xmlns:wne="http://schemas.microsoft.com/office/word/2006/wordml" xmlns:wps="http://schemas.microsoft.com/office/word/2010/wordprocessingShape" mc:Ignorable="w14 w15 w16se w16cid w16 w16cex w16sdtdh w16sdtfl w16du wp14">
   <w:endnote w:type="separator" w:id="-1">
     <w:p>
       <w:r>
@@ -1418,39 +1096,8 @@
 </w:endnotes>
 </file>
 
-<file path=word\fontTable.xml><?xml version="1.0" encoding="utf-8"?>
-<w:fonts xmlns:mc="http://schemas.openxmlformats.org/markup-compatibility/2006" xmlns:r="http://schemas.openxmlformats.org/officeDocument/2006/relationships" xmlns:w="http://schemas.openxmlformats.org/wordprocessingml/2006/main" xmlns:w14="http://schemas.microsoft.com/office/word/2010/wordml" xmlns:w15="http://schemas.microsoft.com/office/word/2012/wordml" xmlns:w16cex="http://schemas.microsoft.com/office/word/2018/wordml/cex" xmlns:w16cid="http://schemas.microsoft.com/office/word/2016/wordml/cid" xmlns:w16="http://schemas.microsoft.com/office/word/2018/wordml" xmlns:w16du="http://schemas.microsoft.com/office/word/2023/wordml/word16du" xmlns:w16sdtdh="http://schemas.microsoft.com/office/word/2020/wordml/sdtdatahash" xmlns:w16sdtfl="http://schemas.microsoft.com/office/word/2024/wordml/sdtformatlock" xmlns:w16se="http://schemas.microsoft.com/office/word/2015/wordml/symex" mc:Ignorable="w14 w15 w16se w16cid w16 w16cex w16sdtdh w16sdtfl w16du">
-  <w:font w:name="Calibri">
-    <w:panose1 w:val="020F0502020204030204"/>
-    <w:charset w:val="00"/>
-    <w:family w:val="swiss"/>
-    <w:pitch w:val="variable"/>
-    <w:sig w:usb0="E4002EFF" w:usb1="C200247B" w:usb2="00000009" w:usb3="00000000" w:csb0="000001FF" w:csb1="00000000"/>
-  </w:font>
-  <w:font w:name="Times New Roman">
-    <w:panose1 w:val="02020603050405020304"/>
-    <w:charset w:val="00"/>
-    <w:family w:val="roman"/>
-    <w:pitch w:val="variable"/>
-    <w:sig w:usb0="E0002EFF" w:usb1="C000785B" w:usb2="00000009" w:usb3="00000000" w:csb0="000001FF" w:csb1="00000000"/>
-  </w:font>
-  <w:font w:name="Aptos Display">
-    <w:charset w:val="00"/>
-    <w:family w:val="swiss"/>
-    <w:pitch w:val="variable"/>
-    <w:sig w:usb0="20000287" w:usb1="00000003" w:usb2="00000000" w:usb3="00000000" w:csb0="0000019F" w:csb1="00000000"/>
-  </w:font>
-  <w:font w:name="Aptos">
-    <w:charset w:val="00"/>
-    <w:family w:val="swiss"/>
-    <w:pitch w:val="variable"/>
-    <w:sig w:usb0="20000287" w:usb1="00000003" w:usb2="00000000" w:usb3="00000000" w:csb0="0000019F" w:csb1="00000000"/>
-  </w:font>
-</w:fonts>
-</file>
-
-<file path=word\footer1.xml><?xml version="1.0" encoding="utf-8"?>
-<w:ftr xmlns:wpc="http://schemas.microsoft.com/office/word/2010/wordprocessingCanvas" xmlns:cx="http://schemas.microsoft.com/office/drawing/2014/chartex" xmlns:cx1="http://schemas.microsoft.com/office/drawing/2015/9/8/chartex" xmlns:cx2="http://schemas.microsoft.com/office/drawing/2015/10/21/chartex" xmlns:cx3="http://schemas.microsoft.com/office/drawing/2016/5/9/chartex" xmlns:cx4="http://schemas.microsoft.com/office/drawing/2016/5/10/chartex" xmlns:cx5="http://schemas.microsoft.com/office/drawing/2016/5/11/chartex" xmlns:cx6="http://schemas.microsoft.com/office/drawing/2016/5/12/chartex" xmlns:cx7="http://schemas.microsoft.com/office/drawing/2016/5/13/chartex" xmlns:cx8="http://schemas.microsoft.com/office/drawing/2016/5/14/chartex" xmlns:mc="http://schemas.openxmlformats.org/markup-compatibility/2006" xmlns:aink="http://schemas.microsoft.com/office/drawing/2016/ink" xmlns:am3d="http://schemas.microsoft.com/office/drawing/2017/model3d" xmlns:o="urn:schemas-microsoft-com:office:office" xmlns:oel="http://schemas.microsoft.com/office/2019/extlst" xmlns:r="http://schemas.openxmlformats.org/officeDocument/2006/relationships" xmlns:m="http://schemas.openxmlformats.org/officeDocument/2006/math" xmlns:v="urn:schemas-microsoft-com:vml" xmlns:wp14="http://schemas.microsoft.com/office/word/2010/wordprocessingDrawing" xmlns:wp="http://schemas.openxmlformats.org/drawingml/2006/wordprocessingDrawing" xmlns:w10="urn:schemas-microsoft-com:office:word" xmlns:w="http://schemas.openxmlformats.org/wordprocessingml/2006/main" xmlns:w14="http://schemas.microsoft.com/office/word/2010/wordml" xmlns:w15="http://schemas.microsoft.com/office/word/2012/wordml" xmlns:w16cei="http://schemas.microsoft.com/office/word/2026/wordml/cei" xmlns:w16cex="http://schemas.microsoft.com/office/word/2018/wordml/cex" xmlns:w16cid="http://schemas.microsoft.com/office/word/2016/wordml/cid" xmlns:w16="http://schemas.microsoft.com/office/word/2018/wordml" xmlns:w16du="http://schemas.microsoft.com/office/word/2023/wordml/word16du" xmlns:w16sdtdh="http://schemas.microsoft.com/office/word/2020/wordml/sdtdatahash" xmlns:w16sdtfl="http://schemas.microsoft.com/office/word/2024/wordml/sdtformatlock" xmlns:w16se="http://schemas.microsoft.com/office/word/2015/wordml/symex" xmlns:wpg="http://schemas.microsoft.com/office/word/2010/wordprocessingGroup" xmlns:wpi="http://schemas.microsoft.com/office/word/2010/wordprocessingInk" xmlns:wne="http://schemas.microsoft.com/office/word/2006/wordml" xmlns:wps="http://schemas.microsoft.com/office/word/2010/wordprocessingShape" mc:Ignorable="w14 w15 w16se w16cid w16 w16cex w16sdtdh w16sdtfl w16du wp14">
+<file path=word/footer1.xml><?xml version="1.0" encoding="utf-8"?>
+<w:ftr xmlns:wpc="http://schemas.microsoft.com/office/word/2010/wordprocessingCanvas" xmlns:cx="http://schemas.microsoft.com/office/drawing/2014/chartex" xmlns:cx1="http://schemas.microsoft.com/office/drawing/2015/9/8/chartex" xmlns:cx2="http://schemas.microsoft.com/office/drawing/2015/10/21/chartex" xmlns:cx3="http://schemas.microsoft.com/office/drawing/2016/5/9/chartex" xmlns:cx4="http://schemas.microsoft.com/office/drawing/2016/5/10/chartex" xmlns:cx5="http://schemas.microsoft.com/office/drawing/2016/5/11/chartex" xmlns:cx6="http://schemas.microsoft.com/office/drawing/2016/5/12/chartex" xmlns:cx7="http://schemas.microsoft.com/office/drawing/2016/5/13/chartex" xmlns:cx8="http://schemas.microsoft.com/office/drawing/2016/5/14/chartex" xmlns:mc="http://schemas.openxmlformats.org/markup-compatibility/2006" xmlns:aink="http://schemas.microsoft.com/office/drawing/2016/ink" xmlns:am3d="http://schemas.microsoft.com/office/drawing/2017/model3d" xmlns:o="urn:schemas-microsoft-com:office:office" xmlns:oel="http://schemas.microsoft.com/office/2019/extlst" xmlns:r="http://schemas.openxmlformats.org/officeDocument/2006/relationships" xmlns:m="http://schemas.openxmlformats.org/officeDocument/2006/math" xmlns:v="urn:schemas-microsoft-com:vml" xmlns:wp14="http://schemas.microsoft.com/office/word/2010/wordprocessingDrawing" xmlns:wp="http://schemas.openxmlformats.org/drawingml/2006/wordprocessingDrawing" xmlns:w10="urn:schemas-microsoft-com:office:word" xmlns:w="http://schemas.openxmlformats.org/wordprocessingml/2006/main" xmlns:w14="http://schemas.microsoft.com/office/word/2010/wordml" xmlns:w15="http://schemas.microsoft.com/office/word/2012/wordml" xmlns:w16cex="http://schemas.microsoft.com/office/word/2018/wordml/cex" xmlns:w16cid="http://schemas.microsoft.com/office/word/2016/wordml/cid" xmlns:w16="http://schemas.microsoft.com/office/word/2018/wordml" xmlns:w16du="http://schemas.microsoft.com/office/word/2023/wordml/word16du" xmlns:w16sdtdh="http://schemas.microsoft.com/office/word/2020/wordml/sdtdatahash" xmlns:w16sdtfl="http://schemas.microsoft.com/office/word/2024/wordml/sdtformatlock" xmlns:w16se="http://schemas.microsoft.com/office/word/2015/wordml/symex" xmlns:wpg="http://schemas.microsoft.com/office/word/2010/wordprocessingGroup" xmlns:wpi="http://schemas.microsoft.com/office/word/2010/wordprocessingInk" xmlns:wne="http://schemas.microsoft.com/office/word/2006/wordml" xmlns:wps="http://schemas.microsoft.com/office/word/2010/wordprocessingShape" mc:Ignorable="w14 w15 w16se w16cid w16 w16cex w16sdtdh w16sdtfl w16du wp14">
   <w:p>
     <w:pPr>
       <w:jc w:val="center"/>
@@ -1557,8 +1204,8 @@
 </w:ftr>
 </file>
 
-<file path=word\footnotes.xml><?xml version="1.0" encoding="utf-8"?>
-<w:footnotes xmlns:wpc="http://schemas.microsoft.com/office/word/2010/wordprocessingCanvas" xmlns:cx="http://schemas.microsoft.com/office/drawing/2014/chartex" xmlns:cx1="http://schemas.microsoft.com/office/drawing/2015/9/8/chartex" xmlns:cx2="http://schemas.microsoft.com/office/drawing/2015/10/21/chartex" xmlns:cx3="http://schemas.microsoft.com/office/drawing/2016/5/9/chartex" xmlns:cx4="http://schemas.microsoft.com/office/drawing/2016/5/10/chartex" xmlns:cx5="http://schemas.microsoft.com/office/drawing/2016/5/11/chartex" xmlns:cx6="http://schemas.microsoft.com/office/drawing/2016/5/12/chartex" xmlns:cx7="http://schemas.microsoft.com/office/drawing/2016/5/13/chartex" xmlns:cx8="http://schemas.microsoft.com/office/drawing/2016/5/14/chartex" xmlns:mc="http://schemas.openxmlformats.org/markup-compatibility/2006" xmlns:aink="http://schemas.microsoft.com/office/drawing/2016/ink" xmlns:am3d="http://schemas.microsoft.com/office/drawing/2017/model3d" xmlns:o="urn:schemas-microsoft-com:office:office" xmlns:oel="http://schemas.microsoft.com/office/2019/extlst" xmlns:r="http://schemas.openxmlformats.org/officeDocument/2006/relationships" xmlns:m="http://schemas.openxmlformats.org/officeDocument/2006/math" xmlns:v="urn:schemas-microsoft-com:vml" xmlns:wp14="http://schemas.microsoft.com/office/word/2010/wordprocessingDrawing" xmlns:wp="http://schemas.openxmlformats.org/drawingml/2006/wordprocessingDrawing" xmlns:w10="urn:schemas-microsoft-com:office:word" xmlns:w="http://schemas.openxmlformats.org/wordprocessingml/2006/main" xmlns:w14="http://schemas.microsoft.com/office/word/2010/wordml" xmlns:w15="http://schemas.microsoft.com/office/word/2012/wordml" xmlns:w16cei="http://schemas.microsoft.com/office/word/2026/wordml/cei" xmlns:w16cex="http://schemas.microsoft.com/office/word/2018/wordml/cex" xmlns:w16cid="http://schemas.microsoft.com/office/word/2016/wordml/cid" xmlns:w16="http://schemas.microsoft.com/office/word/2018/wordml" xmlns:w16du="http://schemas.microsoft.com/office/word/2023/wordml/word16du" xmlns:w16sdtdh="http://schemas.microsoft.com/office/word/2020/wordml/sdtdatahash" xmlns:w16sdtfl="http://schemas.microsoft.com/office/word/2024/wordml/sdtformatlock" xmlns:w16se="http://schemas.microsoft.com/office/word/2015/wordml/symex" xmlns:wpg="http://schemas.microsoft.com/office/word/2010/wordprocessingGroup" xmlns:wpi="http://schemas.microsoft.com/office/word/2010/wordprocessingInk" xmlns:wne="http://schemas.microsoft.com/office/word/2006/wordml" xmlns:wps="http://schemas.microsoft.com/office/word/2010/wordprocessingShape" mc:Ignorable="w14 w15 w16se w16cid w16 w16cex w16sdtdh w16sdtfl w16du wp14">
+<file path=word/footnotes.xml><?xml version="1.0" encoding="utf-8"?>
+<w:footnotes xmlns:wpc="http://schemas.microsoft.com/office/word/2010/wordprocessingCanvas" xmlns:cx="http://schemas.microsoft.com/office/drawing/2014/chartex" xmlns:cx1="http://schemas.microsoft.com/office/drawing/2015/9/8/chartex" xmlns:cx2="http://schemas.microsoft.com/office/drawing/2015/10/21/chartex" xmlns:cx3="http://schemas.microsoft.com/office/drawing/2016/5/9/chartex" xmlns:cx4="http://schemas.microsoft.com/office/drawing/2016/5/10/chartex" xmlns:cx5="http://schemas.microsoft.com/office/drawing/2016/5/11/chartex" xmlns:cx6="http://schemas.microsoft.com/office/drawing/2016/5/12/chartex" xmlns:cx7="http://schemas.microsoft.com/office/drawing/2016/5/13/chartex" xmlns:cx8="http://schemas.microsoft.com/office/drawing/2016/5/14/chartex" xmlns:mc="http://schemas.openxmlformats.org/markup-compatibility/2006" xmlns:aink="http://schemas.microsoft.com/office/drawing/2016/ink" xmlns:am3d="http://schemas.microsoft.com/office/drawing/2017/model3d" xmlns:o="urn:schemas-microsoft-com:office:office" xmlns:oel="http://schemas.microsoft.com/office/2019/extlst" xmlns:r="http://schemas.openxmlformats.org/officeDocument/2006/relationships" xmlns:m="http://schemas.openxmlformats.org/officeDocument/2006/math" xmlns:v="urn:schemas-microsoft-com:vml" xmlns:wp14="http://schemas.microsoft.com/office/word/2010/wordprocessingDrawing" xmlns:wp="http://schemas.openxmlformats.org/drawingml/2006/wordprocessingDrawing" xmlns:w10="urn:schemas-microsoft-com:office:word" xmlns:w="http://schemas.openxmlformats.org/wordprocessingml/2006/main" xmlns:w14="http://schemas.microsoft.com/office/word/2010/wordml" xmlns:w15="http://schemas.microsoft.com/office/word/2012/wordml" xmlns:w16cex="http://schemas.microsoft.com/office/word/2018/wordml/cex" xmlns:w16cid="http://schemas.microsoft.com/office/word/2016/wordml/cid" xmlns:w16="http://schemas.microsoft.com/office/word/2018/wordml" xmlns:w16du="http://schemas.microsoft.com/office/word/2023/wordml/word16du" xmlns:w16sdtdh="http://schemas.microsoft.com/office/word/2020/wordml/sdtdatahash" xmlns:w16sdtfl="http://schemas.microsoft.com/office/word/2024/wordml/sdtformatlock" xmlns:w16se="http://schemas.microsoft.com/office/word/2015/wordml/symex" xmlns:wpg="http://schemas.microsoft.com/office/word/2010/wordprocessingGroup" xmlns:wpi="http://schemas.microsoft.com/office/word/2010/wordprocessingInk" xmlns:wne="http://schemas.microsoft.com/office/word/2006/wordml" xmlns:wps="http://schemas.microsoft.com/office/word/2010/wordprocessingShape" mc:Ignorable="w14 w15 w16se w16cid w16 w16cex w16sdtdh w16sdtfl w16du wp14">
   <w:footnote w:type="separator" w:id="-1">
     <w:p>
       <w:r>
@@ -1576,9 +1223,117 @@
 </w:footnotes>
 </file>
 
-<file path=word\numbering.xml><?xml version="1.0" encoding="utf-8"?>
-<w:numbering xmlns:wpc="http://schemas.microsoft.com/office/word/2010/wordprocessingCanvas" xmlns:cx="http://schemas.microsoft.com/office/drawing/2014/chartex" xmlns:cx1="http://schemas.microsoft.com/office/drawing/2015/9/8/chartex" xmlns:cx2="http://schemas.microsoft.com/office/drawing/2015/10/21/chartex" xmlns:cx3="http://schemas.microsoft.com/office/drawing/2016/5/9/chartex" xmlns:cx4="http://schemas.microsoft.com/office/drawing/2016/5/10/chartex" xmlns:cx5="http://schemas.microsoft.com/office/drawing/2016/5/11/chartex" xmlns:cx6="http://schemas.microsoft.com/office/drawing/2016/5/12/chartex" xmlns:cx7="http://schemas.microsoft.com/office/drawing/2016/5/13/chartex" xmlns:cx8="http://schemas.microsoft.com/office/drawing/2016/5/14/chartex" xmlns:mc="http://schemas.openxmlformats.org/markup-compatibility/2006" xmlns:aink="http://schemas.microsoft.com/office/drawing/2016/ink" xmlns:am3d="http://schemas.microsoft.com/office/drawing/2017/model3d" xmlns:o="urn:schemas-microsoft-com:office:office" xmlns:oel="http://schemas.microsoft.com/office/2019/extlst" xmlns:r="http://schemas.openxmlformats.org/officeDocument/2006/relationships" xmlns:m="http://schemas.openxmlformats.org/officeDocument/2006/math" xmlns:v="urn:schemas-microsoft-com:vml" xmlns:wp14="http://schemas.microsoft.com/office/word/2010/wordprocessingDrawing" xmlns:wp="http://schemas.openxmlformats.org/drawingml/2006/wordprocessingDrawing" xmlns:w10="urn:schemas-microsoft-com:office:word" xmlns:w="http://schemas.openxmlformats.org/wordprocessingml/2006/main" xmlns:w14="http://schemas.microsoft.com/office/word/2010/wordml" xmlns:w15="http://schemas.microsoft.com/office/word/2012/wordml" xmlns:w16cei="http://schemas.microsoft.com/office/word/2026/wordml/cei" xmlns:w16cex="http://schemas.microsoft.com/office/word/2018/wordml/cex" xmlns:w16cid="http://schemas.microsoft.com/office/word/2016/wordml/cid" xmlns:w16="http://schemas.microsoft.com/office/word/2018/wordml" xmlns:w16du="http://schemas.microsoft.com/office/word/2023/wordml/word16du" xmlns:w16sdtdh="http://schemas.microsoft.com/office/word/2020/wordml/sdtdatahash" xmlns:w16sdtfl="http://schemas.microsoft.com/office/word/2024/wordml/sdtformatlock" xmlns:w16se="http://schemas.microsoft.com/office/word/2015/wordml/symex" xmlns:wpg="http://schemas.microsoft.com/office/word/2010/wordprocessingGroup" xmlns:wpi="http://schemas.microsoft.com/office/word/2010/wordprocessingInk" xmlns:wne="http://schemas.microsoft.com/office/word/2006/wordml" xmlns:wps="http://schemas.microsoft.com/office/word/2010/wordprocessingShape" mc:Ignorable="w14 w15 w16se w16cid w16 w16cex w16sdtdh w16sdtfl w16du wp14">
+<file path=word/numbering.xml><?xml version="1.0" encoding="utf-8"?>
+<w:numbering xmlns:wpc="http://schemas.microsoft.com/office/word/2010/wordprocessingCanvas" xmlns:cx="http://schemas.microsoft.com/office/drawing/2014/chartex" xmlns:cx1="http://schemas.microsoft.com/office/drawing/2015/9/8/chartex" xmlns:cx2="http://schemas.microsoft.com/office/drawing/2015/10/21/chartex" xmlns:cx3="http://schemas.microsoft.com/office/drawing/2016/5/9/chartex" xmlns:cx4="http://schemas.microsoft.com/office/drawing/2016/5/10/chartex" xmlns:cx5="http://schemas.microsoft.com/office/drawing/2016/5/11/chartex" xmlns:cx6="http://schemas.microsoft.com/office/drawing/2016/5/12/chartex" xmlns:cx7="http://schemas.microsoft.com/office/drawing/2016/5/13/chartex" xmlns:cx8="http://schemas.microsoft.com/office/drawing/2016/5/14/chartex" xmlns:mc="http://schemas.openxmlformats.org/markup-compatibility/2006" xmlns:aink="http://schemas.microsoft.com/office/drawing/2016/ink" xmlns:am3d="http://schemas.microsoft.com/office/drawing/2017/model3d" xmlns:o="urn:schemas-microsoft-com:office:office" xmlns:oel="http://schemas.microsoft.com/office/2019/extlst" xmlns:r="http://schemas.openxmlformats.org/officeDocument/2006/relationships" xmlns:m="http://schemas.openxmlformats.org/officeDocument/2006/math" xmlns:v="urn:schemas-microsoft-com:vml" xmlns:wp14="http://schemas.microsoft.com/office/word/2010/wordprocessingDrawing" xmlns:wp="http://schemas.openxmlformats.org/drawingml/2006/wordprocessingDrawing" xmlns:w10="urn:schemas-microsoft-com:office:word" xmlns:w="http://schemas.openxmlformats.org/wordprocessingml/2006/main" xmlns:w14="http://schemas.microsoft.com/office/word/2010/wordml" xmlns:w15="http://schemas.microsoft.com/office/word/2012/wordml" xmlns:w16cex="http://schemas.microsoft.com/office/word/2018/wordml/cex" xmlns:w16cid="http://schemas.microsoft.com/office/word/2016/wordml/cid" xmlns:w16="http://schemas.microsoft.com/office/word/2018/wordml" xmlns:w16du="http://schemas.microsoft.com/office/word/2023/wordml/word16du" xmlns:w16sdtdh="http://schemas.microsoft.com/office/word/2020/wordml/sdtdatahash" xmlns:w16sdtfl="http://schemas.microsoft.com/office/word/2024/wordml/sdtformatlock" xmlns:w16se="http://schemas.microsoft.com/office/word/2015/wordml/symex" xmlns:wpg="http://schemas.microsoft.com/office/word/2010/wordprocessingGroup" xmlns:wpi="http://schemas.microsoft.com/office/word/2010/wordprocessingInk" xmlns:wne="http://schemas.microsoft.com/office/word/2006/wordml" xmlns:wps="http://schemas.microsoft.com/office/word/2010/wordprocessingShape" mc:Ignorable="w14 w15 w16se w16cid w16 w16cex w16sdtdh w16sdtfl w16du wp14">
   <w:abstractNum w:abstractNumId="0" w15:restartNumberingAfterBreak="0">
+    <w:nsid w:val="03BF6D46"/>
+    <w:multiLevelType w:val="multilevel"/>
+    <w:tmpl w:val="06180584"/>
+    <w:lvl w:ilvl="0">
+      <w:start w:val="1"/>
+      <w:numFmt w:val="bullet"/>
+      <w:lvlText w:val="–"/>
+      <w:lvlJc w:val="left"/>
+      <w:pPr>
+        <w:ind w:left="400" w:hanging="200"/>
+      </w:pPr>
+    </w:lvl>
+    <w:lvl w:ilvl="1">
+      <w:numFmt w:val="decimal"/>
+      <w:lvlText w:val=""/>
+      <w:lvlJc w:val="left"/>
+    </w:lvl>
+    <w:lvl w:ilvl="2">
+      <w:numFmt w:val="decimal"/>
+      <w:lvlText w:val=""/>
+      <w:lvlJc w:val="left"/>
+    </w:lvl>
+    <w:lvl w:ilvl="3">
+      <w:numFmt w:val="decimal"/>
+      <w:lvlText w:val=""/>
+      <w:lvlJc w:val="left"/>
+    </w:lvl>
+    <w:lvl w:ilvl="4">
+      <w:numFmt w:val="decimal"/>
+      <w:lvlText w:val=""/>
+      <w:lvlJc w:val="left"/>
+    </w:lvl>
+    <w:lvl w:ilvl="5">
+      <w:numFmt w:val="decimal"/>
+      <w:lvlText w:val=""/>
+      <w:lvlJc w:val="left"/>
+    </w:lvl>
+    <w:lvl w:ilvl="6">
+      <w:numFmt w:val="decimal"/>
+      <w:lvlText w:val=""/>
+      <w:lvlJc w:val="left"/>
+    </w:lvl>
+    <w:lvl w:ilvl="7">
+      <w:numFmt w:val="decimal"/>
+      <w:lvlText w:val=""/>
+      <w:lvlJc w:val="left"/>
+    </w:lvl>
+    <w:lvl w:ilvl="8">
+      <w:numFmt w:val="decimal"/>
+      <w:lvlText w:val=""/>
+      <w:lvlJc w:val="left"/>
+    </w:lvl>
+  </w:abstractNum>
+  <w:abstractNum w:abstractNumId="1" w15:restartNumberingAfterBreak="0">
+    <w:nsid w:val="327F5D30"/>
+    <w:multiLevelType w:val="multilevel"/>
+    <w:tmpl w:val="06180584"/>
+    <w:lvl w:ilvl="0">
+      <w:start w:val="1"/>
+      <w:numFmt w:val="bullet"/>
+      <w:lvlText w:val="–"/>
+      <w:lvlJc w:val="left"/>
+      <w:pPr>
+        <w:ind w:left="400" w:hanging="200"/>
+      </w:pPr>
+    </w:lvl>
+    <w:lvl w:ilvl="1">
+      <w:numFmt w:val="decimal"/>
+      <w:lvlText w:val=""/>
+      <w:lvlJc w:val="left"/>
+    </w:lvl>
+    <w:lvl w:ilvl="2">
+      <w:numFmt w:val="decimal"/>
+      <w:lvlText w:val=""/>
+      <w:lvlJc w:val="left"/>
+    </w:lvl>
+    <w:lvl w:ilvl="3">
+      <w:numFmt w:val="decimal"/>
+      <w:lvlText w:val=""/>
+      <w:lvlJc w:val="left"/>
+    </w:lvl>
+    <w:lvl w:ilvl="4">
+      <w:numFmt w:val="decimal"/>
+      <w:lvlText w:val=""/>
+      <w:lvlJc w:val="left"/>
+    </w:lvl>
+    <w:lvl w:ilvl="5">
+      <w:numFmt w:val="decimal"/>
+      <w:lvlText w:val=""/>
+      <w:lvlJc w:val="left"/>
+    </w:lvl>
+    <w:lvl w:ilvl="6">
+      <w:numFmt w:val="decimal"/>
+      <w:lvlText w:val=""/>
+      <w:lvlJc w:val="left"/>
+    </w:lvl>
+    <w:lvl w:ilvl="7">
+      <w:numFmt w:val="decimal"/>
+      <w:lvlText w:val=""/>
+      <w:lvlJc w:val="left"/>
+    </w:lvl>
+    <w:lvl w:ilvl="8">
+      <w:numFmt w:val="decimal"/>
+      <w:lvlText w:val=""/>
+      <w:lvlJc w:val="left"/>
+    </w:lvl>
+  </w:abstractNum>
+  <w:abstractNum w:abstractNumId="2" w15:restartNumberingAfterBreak="0">
     <w:nsid w:val="490047FD"/>
     <w:multiLevelType w:val="hybridMultilevel"/>
     <w:tmpl w:val="06180584"/>
@@ -1632,7 +1387,7 @@
       <w:lvlJc w:val="left"/>
     </w:lvl>
   </w:abstractNum>
-  <w:abstractNum w:abstractNumId="1" w15:restartNumberingAfterBreak="0">
+  <w:abstractNum w:abstractNumId="3" w15:restartNumberingAfterBreak="0">
     <w:nsid w:val="51987DCE"/>
     <w:multiLevelType w:val="hybridMultilevel"/>
     <w:tmpl w:val="450C5418"/>
@@ -1686,7 +1441,7 @@
       <w:lvlJc w:val="left"/>
     </w:lvl>
   </w:abstractNum>
-  <w:abstractNum w:abstractNumId="2" w15:restartNumberingAfterBreak="0">
+  <w:abstractNum w:abstractNumId="4" w15:restartNumberingAfterBreak="0">
     <w:nsid w:val="60CA5F65"/>
     <w:multiLevelType w:val="hybridMultilevel"/>
     <w:tmpl w:val="F67C753E"/>
@@ -1773,85 +1528,36 @@
     </w:lvl>
   </w:abstractNum>
   <w:num w:numId="1" w16cid:durableId="793401889">
+    <w:abstractNumId w:val="4"/>
+    <w:lvlOverride w:ilvl="0">
+      <w:startOverride w:val="1"/>
+    </w:lvlOverride>
+  </w:num>
+  <w:num w:numId="2" w16cid:durableId="1112943169">
+    <w:abstractNumId w:val="3"/>
+    <w:lvlOverride w:ilvl="0">
+      <w:startOverride w:val="1"/>
+    </w:lvlOverride>
+  </w:num>
+  <w:num w:numId="3" w16cid:durableId="1790050428">
     <w:abstractNumId w:val="2"/>
     <w:lvlOverride w:ilvl="0">
       <w:startOverride w:val="1"/>
     </w:lvlOverride>
   </w:num>
-  <w:num w:numId="2" w16cid:durableId="1112943169">
+  <w:num w:numId="4" w16cid:durableId="1842232141">
+    <w:abstractNumId w:val="2"/>
+  </w:num>
+  <w:num w:numId="5" w16cid:durableId="2094357230">
     <w:abstractNumId w:val="1"/>
-    <w:lvlOverride w:ilvl="0">
-      <w:startOverride w:val="1"/>
-    </w:lvlOverride>
   </w:num>
-  <w:num w:numId="3" w16cid:durableId="1790050428">
+  <w:num w:numId="6" w16cid:durableId="472412917">
     <w:abstractNumId w:val="0"/>
-    <w:lvlOverride w:ilvl="0">
-      <w:startOverride w:val="1"/>
-    </w:lvlOverride>
   </w:num>
 </w:numbering>
 </file>
 
-<file path=word\settings.xml><?xml version="1.0" encoding="utf-8"?>
-<w:settings xmlns:mc="http://schemas.openxmlformats.org/markup-compatibility/2006" xmlns:o="urn:schemas-microsoft-com:office:office" xmlns:r="http://schemas.openxmlformats.org/officeDocument/2006/relationships" xmlns:m="http://schemas.openxmlformats.org/officeDocument/2006/math" xmlns:v="urn:schemas-microsoft-com:vml" xmlns:w10="urn:schemas-microsoft-com:office:word" xmlns:w="http://schemas.openxmlformats.org/wordprocessingml/2006/main" xmlns:w14="http://schemas.microsoft.com/office/word/2010/wordml" xmlns:w15="http://schemas.microsoft.com/office/word/2012/wordml" xmlns:w16cex="http://schemas.microsoft.com/office/word/2018/wordml/cex" xmlns:w16cid="http://schemas.microsoft.com/office/word/2016/wordml/cid" xmlns:w16="http://schemas.microsoft.com/office/word/2018/wordml" xmlns:w16du="http://schemas.microsoft.com/office/word/2023/wordml/word16du" xmlns:w16sdtdh="http://schemas.microsoft.com/office/word/2020/wordml/sdtdatahash" xmlns:w16sdtfl="http://schemas.microsoft.com/office/word/2024/wordml/sdtformatlock" xmlns:w16se="http://schemas.microsoft.com/office/word/2015/wordml/symex" xmlns:sl="http://schemas.openxmlformats.org/schemaLibrary/2006/main" mc:Ignorable="w14 w15 w16se w16cid w16 w16cex w16sdtdh w16sdtfl w16du">
-  <w:zoom w:percent="100"/>
-  <w:displayBackgroundShape/>
-  <w:proofState w:spelling="clean" w:grammar="clean"/>
-  <w:defaultTabStop w:val="720"/>
-  <w:characterSpacingControl w:val="doNotCompress"/>
-  <w:footnotePr>
-    <w:footnote w:id="-1"/>
-    <w:footnote w:id="0"/>
-  </w:footnotePr>
-  <w:endnotePr>
-    <w:endnote w:id="-1"/>
-    <w:endnote w:id="0"/>
-  </w:endnotePr>
-  <w:compat>
-    <w:compatSetting w:name="compatibilityMode" w:uri="http://schemas.microsoft.com/office/word" w:val="15"/>
-    <w:compatSetting w:name="overrideTableStyleFontSizeAndJustification" w:uri="http://schemas.microsoft.com/office/word" w:val="1"/>
-    <w:compatSetting w:name="enableOpenTypeFeatures" w:uri="http://schemas.microsoft.com/office/word" w:val="1"/>
-    <w:compatSetting w:name="doNotFlipMirrorIndents" w:uri="http://schemas.microsoft.com/office/word" w:val="1"/>
-    <w:compatSetting w:name="differentiateMultirowTableHeaders" w:uri="http://schemas.microsoft.com/office/word" w:val="1"/>
-    <w:compatSetting w:name="useWord2013TrackBottomHyphenation" w:uri="http://schemas.microsoft.com/office/word" w:val="1"/>
-  </w:compat>
-  <w:rsids>
-    <w:rsidRoot w:val="00013741"/>
-    <w:rsid w:val="00013741"/>
-    <w:rsid w:val="005959E8"/>
-    <w:rsid w:val="00AA440A"/>
-    <w:rsid w:val="00AE2843"/>
-  </w:rsids>
-  <m:mathPr>
-    <m:mathFont m:val="Cambria Math"/>
-    <m:brkBin m:val="before"/>
-    <m:brkBinSub m:val="--"/>
-    <m:smallFrac m:val="0"/>
-    <m:dispDef/>
-    <m:lMargin m:val="0"/>
-    <m:rMargin m:val="0"/>
-    <m:defJc m:val="centerGroup"/>
-    <m:wrapIndent m:val="1440"/>
-    <m:intLim m:val="subSup"/>
-    <m:naryLim m:val="undOvr"/>
-  </m:mathPr>
-  <w:themeFontLang w:val="en-PH"/>
-  <w:clrSchemeMapping w:bg1="light1" w:t1="dark1" w:bg2="light2" w:t2="dark2" w:accent1="accent1" w:accent2="accent2" w:accent3="accent3" w:accent4="accent4" w:accent5="accent5" w:accent6="accent6" w:hyperlink="hyperlink" w:followedHyperlink="followedHyperlink"/>
-  <w:shapeDefaults>
-    <o:shapedefaults v:ext="edit" spidmax="1026"/>
-    <o:shapelayout v:ext="edit">
-      <o:idmap v:ext="edit" data="1"/>
-    </o:shapelayout>
-  </w:shapeDefaults>
-  <w:decimalSymbol w:val="."/>
-  <w:listSeparator w:val=","/>
-  <w14:docId w14:val="6887C0EF"/>
-  <w15:docId w15:val="{42893A7E-CEA1-4622-BBC1-8615746A022A}"/>
-</w:settings>
-</file>
-
-<file path=word\styles.xml><?xml version="1.0" encoding="utf-8"?>
+<file path=word/styles.xml><?xml version="1.0" encoding="utf-8"?>
 <w:styles xmlns:mc="http://schemas.openxmlformats.org/markup-compatibility/2006" xmlns:r="http://schemas.openxmlformats.org/officeDocument/2006/relationships" xmlns:w="http://schemas.openxmlformats.org/wordprocessingml/2006/main" xmlns:w14="http://schemas.microsoft.com/office/word/2010/wordml" xmlns:w15="http://schemas.microsoft.com/office/word/2012/wordml" xmlns:w16cex="http://schemas.microsoft.com/office/word/2018/wordml/cex" xmlns:w16cid="http://schemas.microsoft.com/office/word/2016/wordml/cid" xmlns:w16="http://schemas.microsoft.com/office/word/2018/wordml" xmlns:w16du="http://schemas.microsoft.com/office/word/2023/wordml/word16du" xmlns:w16sdtdh="http://schemas.microsoft.com/office/word/2020/wordml/sdtdatahash" xmlns:w16sdtfl="http://schemas.microsoft.com/office/word/2024/wordml/sdtformatlock" xmlns:w16se="http://schemas.microsoft.com/office/word/2015/wordml/symex" mc:Ignorable="w14 w15 w16se w16cid w16 w16cex w16sdtdh w16sdtfl w16du">
   <w:docDefaults>
     <w:rPrDefault>
@@ -2449,10 +2155,52 @@
       <w:szCs w:val="20"/>
     </w:rPr>
   </w:style>
+  <w:style w:type="paragraph" w:styleId="Header">
+    <w:name w:val="header"/>
+    <w:basedOn w:val="Normal"/>
+    <w:link w:val="HeaderChar"/>
+    <w:uiPriority w:val="99"/>
+    <w:unhideWhenUsed/>
+    <w:rsid w:val="00B63687"/>
+    <w:pPr>
+      <w:tabs>
+        <w:tab w:val="center" w:pos="4680"/>
+        <w:tab w:val="right" w:pos="9360"/>
+      </w:tabs>
+    </w:pPr>
+  </w:style>
+  <w:style w:type="character" w:customStyle="1" w:styleId="HeaderChar">
+    <w:name w:val="Header Char"/>
+    <w:basedOn w:val="DefaultParagraphFont"/>
+    <w:link w:val="Header"/>
+    <w:uiPriority w:val="99"/>
+    <w:rsid w:val="00B63687"/>
+  </w:style>
+  <w:style w:type="paragraph" w:styleId="Footer">
+    <w:name w:val="footer"/>
+    <w:basedOn w:val="Normal"/>
+    <w:link w:val="FooterChar"/>
+    <w:uiPriority w:val="99"/>
+    <w:unhideWhenUsed/>
+    <w:rsid w:val="00B63687"/>
+    <w:pPr>
+      <w:tabs>
+        <w:tab w:val="center" w:pos="4680"/>
+        <w:tab w:val="right" w:pos="9360"/>
+      </w:tabs>
+    </w:pPr>
+  </w:style>
+  <w:style w:type="character" w:customStyle="1" w:styleId="FooterChar">
+    <w:name w:val="Footer Char"/>
+    <w:basedOn w:val="DefaultParagraphFont"/>
+    <w:link w:val="Footer"/>
+    <w:uiPriority w:val="99"/>
+    <w:rsid w:val="00B63687"/>
+  </w:style>
 </w:styles>
 </file>
 
-<file path=word\theme\theme1.xml><?xml version="1.0" encoding="utf-8"?>
+<file path=word/theme/theme1.xml><?xml version="1.0" encoding="utf-8"?>
 <a:theme xmlns:a="http://schemas.openxmlformats.org/drawingml/2006/main" name="Office Theme">
   <a:themeElements>
     <a:clrScheme name="Office">
@@ -2765,8 +2513,4 @@
     </a:ext>
   </a:extLst>
 </a:theme>
-</file>
-
-<file path=word\webSettings.xml><?xml version="1.0" encoding="utf-8"?>
-<w:webSettings xmlns:mc="http://schemas.openxmlformats.org/markup-compatibility/2006" xmlns:r="http://schemas.openxmlformats.org/officeDocument/2006/relationships" xmlns:w="http://schemas.openxmlformats.org/wordprocessingml/2006/main" xmlns:w14="http://schemas.microsoft.com/office/word/2010/wordml" xmlns:w15="http://schemas.microsoft.com/office/word/2012/wordml" xmlns:w16cex="http://schemas.microsoft.com/office/word/2018/wordml/cex" xmlns:w16cid="http://schemas.microsoft.com/office/word/2016/wordml/cid" xmlns:w16="http://schemas.microsoft.com/office/word/2018/wordml" xmlns:w16du="http://schemas.microsoft.com/office/word/2023/wordml/word16du" xmlns:w16sdtdh="http://schemas.microsoft.com/office/word/2020/wordml/sdtdatahash" xmlns:w16sdtfl="http://schemas.microsoft.com/office/word/2024/wordml/sdtformatlock" xmlns:w16se="http://schemas.microsoft.com/office/word/2015/wordml/symex" mc:Ignorable="w14 w15 w16se w16cid w16 w16cex w16sdtdh w16sdtfl w16du"/>
 </file>
</xml_diff>

<commit_message>
Update KPIs: 406 tickets, 97.8% SLA, 21.2h MTTR (Nov 2026)
</commit_message>
<xml_diff>
--- a/public/cv/Romeo_David_Jr_CV_Final_ATS.docx
+++ b/public/cv/Romeo_David_Jr_CV_Final_ATS.docx
@@ -111,7 +111,7 @@
         <w:spacing w:after="34"/>
       </w:pPr>
       <w:r>
-        <w:t>Senior Telecommunications Engineer with 19+ years of experience in multi-vendor network operations, project delivery, and operational automation. Currently leading O&amp;M for IDEMIA MestaFusion ATMS across 100+ sites in KSA Central Region, achieving 97.6% YTD SLA compliance with an average MTTR of 22.1 hours. Independently developed practical Python and PowerShell automation tools and Power BI dashboards that reduce daily data-processing time by 65–80%. Combines deep telecom expertise with Generative AI and Agentic AI-assisted development to deliver efficient, real-world solutions.</w:t>
+        <w:t>Senior Telecommunications Engineer with 19+ years of experience in multi-vendor network operations, project delivery, and operational automation. Currently leading O&amp;M for IDEMIA MestaFusion ATMS across 100+ sites in KSA Central Region, achieving 97.8% YTD SLA compliance with an average MTTR of 21.2 hours. Independently developed practical Python and PowerShell automation tools and Power BI dashboards that reduce daily data-processing time by 65–80%. Combines deep telecom expertise with Generative AI and Agentic AI-assisted development to deliver efficient, real-world solutions.</w:t>
       </w:r>
     </w:p>
     <w:p>
@@ -281,7 +281,7 @@
         <w:spacing w:after="5"/>
       </w:pPr>
       <w:r>
-        <w:t>Achieved 97.6% YTD SLA compliance across 372 O&amp;M tickets with zero overdue tickets and 100% restoration rate; maintained average MTTR of 22.1 hours.</w:t>
+        <w:t>Achieved 97.8% YTD SLA compliance across 406 O&amp;M tickets with zero overdue tickets and 100% restoration rate; maintained average MTTR of 21.2 hours.</w:t>
       </w:r>
     </w:p>
     <w:p>

</xml_diff>